<commit_message>
Remove LIMS from scope
The LIMS module is not part of this offer. Removed from all four places it
appeared:

- Overall RACI, SmartMES Software License: "( MES, LIMS modules )" becomes
  "( MES modules )".
- Overall RACI, Layer 3 - MoM Software Implementation: "MES, LIMS" becomes
  "MES".
- Functional Overview, Layer 3 bullet: drops LIMS and laboratory
  management, keeping production execution, traceability and in-process
  quality management.
- Terms and Abbreviations: dropped the LIMS entry, which no longer has a
  referent anywhere in the document.

Co-Authored-By: Claude Opus 5 <noreply@anthropic.com>
Claude-Session: https://claude.ai/code/session_01YStD3bG3sa5RhFH78QQvxt
</commit_message>
<xml_diff>
--- a/JK_Lakshar_MES_XXXXX_Technical Offer_R0.docx
+++ b/JK_Lakshar_MES_XXXXX_Technical Offer_R0.docx
@@ -6007,61 +6007,6 @@
       </w:tr>
       <w:tr>
         <w:trPr>
-          <w:cnfStyle w:val="000000100000" w:firstRow="0" w:lastRow="0" w:firstColumn="0" w:lastColumn="0" w:oddVBand="0" w:evenVBand="0" w:oddHBand="1" w:evenHBand="0" w:firstRowFirstColumn="0" w:firstRowLastColumn="0" w:lastRowFirstColumn="0" w:lastRowLastColumn="0"/>
-          <w:trHeight w:val="341"/>
-        </w:trPr>
-        <w:tc>
-          <w:tcPr>
-            <w:tcW w:w="1696" w:type="dxa"/>
-          </w:tcPr>
-          <w:p>
-            <w:pPr>
-              <w:pStyle w:val="TableText"/>
-              <w:rPr>
-                <w:rFonts w:asciiTheme="minorHAnsi" w:hAnsiTheme="minorHAnsi" w:cstheme="minorHAnsi"/>
-                <w:color w:val="444444"/>
-                <w:sz w:val="22"/>
-                <w:szCs w:val="22"/>
-                <w:lang w:val="en-CA"/>
-              </w:rPr>
-            </w:pPr>
-            <w:r>
-              <w:rPr>
-                <w:rFonts w:asciiTheme="minorHAnsi" w:hAnsiTheme="minorHAnsi" w:cstheme="minorHAnsi"/>
-                <w:sz w:val="22"/>
-                <w:szCs w:val="22"/>
-              </w:rPr>
-              <w:t xml:space="preserve">LIMS </w:t>
-            </w:r>
-          </w:p>
-        </w:tc>
-        <w:tc>
-          <w:tcPr>
-            <w:tcW w:w="7743" w:type="dxa"/>
-          </w:tcPr>
-          <w:p>
-            <w:pPr>
-              <w:pStyle w:val="TableText"/>
-              <w:rPr>
-                <w:rFonts w:asciiTheme="minorHAnsi" w:hAnsiTheme="minorHAnsi" w:cstheme="minorHAnsi"/>
-                <w:sz w:val="22"/>
-                <w:szCs w:val="22"/>
-                <w:lang w:val="en-CA"/>
-              </w:rPr>
-            </w:pPr>
-            <w:r>
-              <w:rPr>
-                <w:rFonts w:asciiTheme="minorHAnsi" w:hAnsiTheme="minorHAnsi" w:cstheme="minorHAnsi"/>
-                <w:sz w:val="22"/>
-                <w:szCs w:val="22"/>
-              </w:rPr>
-              <w:t xml:space="preserve">Laboratory Information Management Systems </w:t>
-            </w:r>
-          </w:p>
-        </w:tc>
-      </w:tr>
-      <w:tr>
-        <w:trPr>
           <w:trHeight w:val="341"/>
         </w:trPr>
         <w:tc>
@@ -6601,7 +6546,7 @@
           <w:b w:val="0"/>
           <w:i w:val="0"/>
         </w:rPr>
-        <w:t>Layer 3 – Manufacturing Operations Management: MES and LIMS for production execution, material and product traceability, quality and laboratory management.</w:t>
+        <w:t>Layer 3 – Manufacturing Operations Management: MES for production execution, material and product traceability and in‑process quality management.</w:t>
       </w:r>
     </w:p>
     <w:p>
@@ -13815,7 +13760,7 @@
                 <w:szCs w:val="20"/>
                 <w:lang w:eastAsia="en-IN"/>
               </w:rPr>
-              <w:t>( MES, LIMS modules )</w:t>
+              <w:t>( MES modules )</w:t>
             </w:r>
             <w:r>
               <w:rPr>
@@ -15112,7 +15057,7 @@
                 <w:szCs w:val="20"/>
                 <w:lang w:eastAsia="en-IN"/>
               </w:rPr>
-              <w:t>MES,</w:t>
+              <w:t>MES</w:t>
             </w:r>
             <w:r>
               <w:rPr>
@@ -15122,7 +15067,6 @@
                 <w:szCs w:val="20"/>
                 <w:lang w:eastAsia="en-IN"/>
               </w:rPr>
-              <w:t xml:space="preserve"> </w:t>
             </w:r>
             <w:r>
               <w:rPr>
@@ -15132,7 +15076,6 @@
                 <w:szCs w:val="20"/>
                 <w:lang w:eastAsia="en-IN"/>
               </w:rPr>
-              <w:t>LIMS</w:t>
             </w:r>
           </w:p>
         </w:tc>

</xml_diff>

<commit_message>
Add Unit-2 recommended interfacing hardware table
Names the specific adapter per controller type behind the generic "OEM
Ethernet Communication Module" of the machine table above it: Mitsubishi
FX2NC-ENET-ADP for the FX2N-64MR fleet, 1747-AENTR EtherNet/IP adapter for
the SLC500, and no module for the FX5U, which uses its built-in Ethernet
behind an industrial NAT device.

Placed under 3.4.1 so both Unit-2 tables sit together, leaving the section
numbering and the table of contents unchanged.

Source URLs and citation markers are omitted; the remarks carry the
substance.

Co-Authored-By: Claude Opus 5 <noreply@anthropic.com>
Claude-Session: https://claude.ai/code/session_01YStD3bG3sa5RhFH78QQvxt
</commit_message>
<xml_diff>
--- a/JK_Lakshar_MES_XXXXX_Technical Offer_R0.docx
+++ b/JK_Lakshar_MES_XXXXX_Technical Offer_R0.docx
@@ -8844,6 +8844,382 @@
           <w:b w:val="0"/>
         </w:rPr>
         <w:t>On the FX2N and SLC500 machines the RS232 port is occupied by the HMI, so no external communication port is free; the recommended OEM Ethernet communication module addresses this. Programming software required for these machines is GX Developer (Mitsubishi) and RSLogix (Allen‑Bradley).</w:t>
+      </w:r>
+    </w:p>
+    <w:p>
+      <w:pPr/>
+      <w:r>
+        <w:t>The interfacing hardware recommended for each controller type in Unit‑2 is given below. Final selection is to be confirmed against the installed hardware configuration of each machine during the Functional Design phase.</w:t>
+      </w:r>
+    </w:p>
+    <w:tbl>
+      <w:tblPr>
+        <w:tblStyle w:val="SCILCorporateTable10"/>
+        <w:tblW w:w="10348" w:type="dxa"/>
+        <w:tblInd w:w="-709" w:type="dxa"/>
+        <w:tblBorders>
+          <w:top w:val="single" w:sz="4" w:space="0" w:color="auto"/>
+          <w:left w:val="single" w:sz="4" w:space="0" w:color="auto"/>
+          <w:bottom w:val="single" w:sz="4" w:space="0" w:color="auto"/>
+          <w:right w:val="single" w:sz="4" w:space="0" w:color="auto"/>
+          <w:insideH w:val="single" w:sz="4" w:space="0" w:color="auto"/>
+          <w:insideV w:val="single" w:sz="4" w:space="0" w:color="auto"/>
+        </w:tblBorders>
+        <w:tblLook w:val="04A0" w:firstRow="1" w:lastRow="0" w:firstColumn="1" w:lastColumn="0" w:noHBand="0" w:noVBand="1"/>
+      </w:tblPr>
+      <w:tblGrid>
+        <w:gridCol w:w="900"/>
+        <w:gridCol w:w="1250"/>
+        <w:gridCol w:w="1000"/>
+        <w:gridCol w:w="3200"/>
+        <w:gridCol w:w="1500"/>
+        <w:gridCol w:w="2498"/>
+      </w:tblGrid>
+      <w:tr>
+        <w:trPr>
+          <w:tblHeader/>
+        </w:trPr>
+        <w:tc>
+          <w:tcPr>
+            <w:tcW w:type="dxa" w:w="900"/>
+          </w:tcPr>
+          <w:p>
+            <w:r>
+              <w:rPr>
+                <w:sz w:val="16"/>
+              </w:rPr>
+              <w:t>Process Area</w:t>
+            </w:r>
+          </w:p>
+        </w:tc>
+        <w:tc>
+          <w:tcPr>
+            <w:tcW w:type="dxa" w:w="1250"/>
+          </w:tcPr>
+          <w:p>
+            <w:r>
+              <w:rPr>
+                <w:sz w:val="16"/>
+              </w:rPr>
+              <w:t>PLC Make</w:t>
+            </w:r>
+          </w:p>
+        </w:tc>
+        <w:tc>
+          <w:tcPr>
+            <w:tcW w:type="dxa" w:w="1000"/>
+          </w:tcPr>
+          <w:p>
+            <w:r>
+              <w:rPr>
+                <w:sz w:val="16"/>
+              </w:rPr>
+              <w:t>PLC Model</w:t>
+            </w:r>
+          </w:p>
+        </w:tc>
+        <w:tc>
+          <w:tcPr>
+            <w:tcW w:type="dxa" w:w="3200"/>
+          </w:tcPr>
+          <w:p>
+            <w:r>
+              <w:rPr>
+                <w:sz w:val="16"/>
+              </w:rPr>
+              <w:t>Recommended Hardware</w:t>
+            </w:r>
+          </w:p>
+        </w:tc>
+        <w:tc>
+          <w:tcPr>
+            <w:tcW w:type="dxa" w:w="1500"/>
+          </w:tcPr>
+          <w:p>
+            <w:r>
+              <w:rPr>
+                <w:sz w:val="16"/>
+              </w:rPr>
+              <w:t>Kepware Connectivity</w:t>
+            </w:r>
+          </w:p>
+        </w:tc>
+        <w:tc>
+          <w:tcPr>
+            <w:tcW w:type="dxa" w:w="2498"/>
+          </w:tcPr>
+          <w:p>
+            <w:r>
+              <w:rPr>
+                <w:sz w:val="16"/>
+              </w:rPr>
+              <w:t>Remarks</w:t>
+            </w:r>
+          </w:p>
+        </w:tc>
+      </w:tr>
+      <w:tr>
+        <w:tc>
+          <w:tcPr>
+            <w:tcW w:type="dxa" w:w="900"/>
+          </w:tcPr>
+          <w:p>
+            <w:r>
+              <w:rPr>
+                <w:sz w:val="16"/>
+              </w:rPr>
+              <w:t>TBB / LCV</w:t>
+            </w:r>
+          </w:p>
+        </w:tc>
+        <w:tc>
+          <w:tcPr>
+            <w:tcW w:type="dxa" w:w="1250"/>
+          </w:tcPr>
+          <w:p>
+            <w:r>
+              <w:rPr>
+                <w:sz w:val="16"/>
+              </w:rPr>
+              <w:t>Mitsubishi</w:t>
+            </w:r>
+          </w:p>
+        </w:tc>
+        <w:tc>
+          <w:tcPr>
+            <w:tcW w:type="dxa" w:w="1000"/>
+          </w:tcPr>
+          <w:p>
+            <w:r>
+              <w:rPr>
+                <w:sz w:val="16"/>
+              </w:rPr>
+              <w:t>FX2N‑64MR</w:t>
+            </w:r>
+          </w:p>
+        </w:tc>
+        <w:tc>
+          <w:tcPr>
+            <w:tcW w:type="dxa" w:w="3200"/>
+          </w:tcPr>
+          <w:p>
+            <w:r>
+              <w:rPr>
+                <w:b/>
+                <w:sz w:val="16"/>
+              </w:rPr>
+              <w:t>Mitsubishi FX2NC‑ENET‑ADP</w:t>
+            </w:r>
+            <w:r>
+              <w:rPr>
+                <w:sz w:val="16"/>
+              </w:rPr>
+              <w:t xml:space="preserve"> (Ethernet Adapter) or an OEM‑compatible Ethernet communication solution for the installed FX2N configuration</w:t>
+            </w:r>
+          </w:p>
+        </w:tc>
+        <w:tc>
+          <w:tcPr>
+            <w:tcW w:type="dxa" w:w="1500"/>
+          </w:tcPr>
+          <w:p>
+            <w:r>
+              <w:rPr>
+                <w:sz w:val="16"/>
+              </w:rPr>
+              <w:t>Mitsubishi Ethernet Driver</w:t>
+            </w:r>
+          </w:p>
+        </w:tc>
+        <w:tc>
+          <w:tcPr>
+            <w:tcW w:type="dxa" w:w="2498"/>
+          </w:tcPr>
+          <w:p>
+            <w:r>
+              <w:rPr>
+                <w:sz w:val="16"/>
+              </w:rPr>
+              <w:t>Mitsubishi documentation shows Ethernet adapters for FX2N‑family controllers, but implementation depends on the installed hardware configuration.</w:t>
+            </w:r>
+          </w:p>
+        </w:tc>
+      </w:tr>
+      <w:tr>
+        <w:tc>
+          <w:tcPr>
+            <w:tcW w:type="dxa" w:w="900"/>
+          </w:tcPr>
+          <w:p>
+            <w:r>
+              <w:rPr>
+                <w:sz w:val="16"/>
+              </w:rPr>
+              <w:t>TBB</w:t>
+            </w:r>
+          </w:p>
+        </w:tc>
+        <w:tc>
+          <w:tcPr>
+            <w:tcW w:type="dxa" w:w="1250"/>
+          </w:tcPr>
+          <w:p>
+            <w:r>
+              <w:rPr>
+                <w:sz w:val="16"/>
+              </w:rPr>
+              <w:t>Allen‑Bradley</w:t>
+            </w:r>
+          </w:p>
+        </w:tc>
+        <w:tc>
+          <w:tcPr>
+            <w:tcW w:type="dxa" w:w="1000"/>
+          </w:tcPr>
+          <w:p>
+            <w:r>
+              <w:rPr>
+                <w:sz w:val="16"/>
+              </w:rPr>
+              <w:t>SLC500</w:t>
+            </w:r>
+          </w:p>
+        </w:tc>
+        <w:tc>
+          <w:tcPr>
+            <w:tcW w:type="dxa" w:w="3200"/>
+          </w:tcPr>
+          <w:p>
+            <w:r>
+              <w:rPr>
+                <w:b/>
+                <w:sz w:val="16"/>
+              </w:rPr>
+              <w:t>1747‑AENTR EtherNet/IP Adapter</w:t>
+            </w:r>
+          </w:p>
+        </w:tc>
+        <w:tc>
+          <w:tcPr>
+            <w:tcW w:type="dxa" w:w="1500"/>
+          </w:tcPr>
+          <w:p>
+            <w:r>
+              <w:rPr>
+                <w:sz w:val="16"/>
+              </w:rPr>
+              <w:t>Allen‑Bradley Ethernet Driver</w:t>
+            </w:r>
+          </w:p>
+        </w:tc>
+        <w:tc>
+          <w:tcPr>
+            <w:tcW w:type="dxa" w:w="2498"/>
+          </w:tcPr>
+          <w:p>
+            <w:r>
+              <w:rPr>
+                <w:sz w:val="16"/>
+              </w:rPr>
+              <w:t>Provides EtherNet/IP connectivity for SLC500 systems.</w:t>
+            </w:r>
+          </w:p>
+        </w:tc>
+      </w:tr>
+      <w:tr>
+        <w:tc>
+          <w:tcPr>
+            <w:tcW w:type="dxa" w:w="900"/>
+          </w:tcPr>
+          <w:p>
+            <w:r>
+              <w:rPr>
+                <w:sz w:val="16"/>
+              </w:rPr>
+              <w:t>LCV</w:t>
+            </w:r>
+          </w:p>
+        </w:tc>
+        <w:tc>
+          <w:tcPr>
+            <w:tcW w:type="dxa" w:w="1250"/>
+          </w:tcPr>
+          <w:p>
+            <w:r>
+              <w:rPr>
+                <w:sz w:val="16"/>
+              </w:rPr>
+              <w:t>Mitsubishi</w:t>
+            </w:r>
+          </w:p>
+        </w:tc>
+        <w:tc>
+          <w:tcPr>
+            <w:tcW w:type="dxa" w:w="1000"/>
+          </w:tcPr>
+          <w:p>
+            <w:r>
+              <w:rPr>
+                <w:sz w:val="16"/>
+              </w:rPr>
+              <w:t>FX5U</w:t>
+            </w:r>
+          </w:p>
+        </w:tc>
+        <w:tc>
+          <w:tcPr>
+            <w:tcW w:type="dxa" w:w="3200"/>
+          </w:tcPr>
+          <w:p>
+            <w:r>
+              <w:rPr>
+                <w:b/>
+                <w:sz w:val="16"/>
+              </w:rPr>
+              <w:t>No communication module required.</w:t>
+            </w:r>
+            <w:r>
+              <w:rPr>
+                <w:sz w:val="16"/>
+              </w:rPr>
+              <w:t xml:space="preserve"> Use the built‑in Ethernet and isolate it using an Industrial NAT device.</w:t>
+            </w:r>
+          </w:p>
+        </w:tc>
+        <w:tc>
+          <w:tcPr>
+            <w:tcW w:type="dxa" w:w="1500"/>
+          </w:tcPr>
+          <w:p>
+            <w:r>
+              <w:rPr>
+                <w:sz w:val="16"/>
+              </w:rPr>
+              <w:t>Mitsubishi Ethernet Driver</w:t>
+            </w:r>
+          </w:p>
+        </w:tc>
+        <w:tc>
+          <w:tcPr>
+            <w:tcW w:type="dxa" w:w="2498"/>
+          </w:tcPr>
+          <w:p>
+            <w:r>
+              <w:rPr>
+                <w:sz w:val="16"/>
+              </w:rPr>
+              <w:t>This is the preferred architecture unless the customer specifically requires an additional Ethernet network module.</w:t>
+            </w:r>
+          </w:p>
+        </w:tc>
+      </w:tr>
+    </w:tbl>
+    <w:p>
+      <w:pPr>
+        <w:pStyle w:val="Caption"/>
+      </w:pPr>
+      <w:r>
+        <w:t>Table: Unit‑2 recommended interfacing hardware</w:t>
       </w:r>
     </w:p>
     <w:p>

</xml_diff>

<commit_message>
Fill IT Architecture with the existing VM estate and the additional VM
Section 4.2 now records the customer's existing virtual machine estate as
the baseline - four VMs across Production and DR, totalling 48 vCPU, 368 GB
RAM, 1024 GB C drive and 3584 GB D drive per environment - and states that
no change to those machines is required.

This project adds one application VM, VM-5, at the same specification as
the existing application VM: 12 vCPU, 64 GB RAM, 256 GB C drive, 512 GB D
drive on Windows Server 2022.

Notes record that the VM is customer supplied per the Roles and
Responsibilities section, that the UAT and DB VMs are assumed shared rather
than duplicated, and that whether a matching VM is needed in DR is still
open - the figures given cover Production only.

Co-Authored-By: Claude Opus 5 <noreply@anthropic.com>
Claude-Session: https://claude.ai/code/session_01YStD3bG3sa5RhFH78QQvxt
</commit_message>
<xml_diff>
--- a/JK_Lakshar_MES_XXXXX_Technical Offer_R0.docx
+++ b/JK_Lakshar_MES_XXXXX_Technical Offer_R0.docx
@@ -25801,6 +25801,2045 @@
       <w:bookmarkEnd w:id="18"/>
       <w:r>
         <w:t xml:space="preserve"> </w:t>
+      </w:r>
+    </w:p>
+    <w:p>
+      <w:pPr/>
+      <w:r>
+        <w:rPr>
+          <w:b w:val="0"/>
+        </w:rPr>
+        <w:t>The virtual machine estate below is already available with the customer, provisioned across a Production and a DR environment. It is reproduced here as the baseline for this offer; no change to the existing virtual machines is required.</w:t>
+      </w:r>
+    </w:p>
+    <w:tbl>
+      <w:tblPr>
+        <w:tblStyle w:val="SCILCorporateTable10"/>
+        <w:tblW w:w="10348" w:type="dxa"/>
+        <w:tblInd w:w="-709" w:type="dxa"/>
+        <w:tblBorders>
+          <w:top w:val="single" w:sz="4" w:space="0" w:color="auto"/>
+          <w:left w:val="single" w:sz="4" w:space="0" w:color="auto"/>
+          <w:bottom w:val="single" w:sz="4" w:space="0" w:color="auto"/>
+          <w:right w:val="single" w:sz="4" w:space="0" w:color="auto"/>
+          <w:insideH w:val="single" w:sz="4" w:space="0" w:color="auto"/>
+          <w:insideV w:val="single" w:sz="4" w:space="0" w:color="auto"/>
+        </w:tblBorders>
+        <w:tblLook w:val="04A0" w:firstRow="1" w:lastRow="0" w:firstColumn="1" w:lastColumn="0" w:noHBand="0" w:noVBand="1"/>
+      </w:tblPr>
+      <w:tblGrid>
+        <w:gridCol w:w="700"/>
+        <w:gridCol w:w="2100"/>
+        <w:gridCol w:w="900"/>
+        <w:gridCol w:w="1900"/>
+        <w:gridCol w:w="1100"/>
+        <w:gridCol w:w="900"/>
+        <w:gridCol w:w="1300"/>
+        <w:gridCol w:w="1448"/>
+      </w:tblGrid>
+      <w:tr>
+        <w:trPr>
+          <w:tblHeader/>
+        </w:trPr>
+        <w:tc>
+          <w:tcPr>
+            <w:tcW w:type="dxa" w:w="700"/>
+          </w:tcPr>
+          <w:p>
+            <w:pPr>
+              <w:spacing w:before="0" w:after="0" w:line="240" w:lineRule="auto"/>
+            </w:pPr>
+            <w:r>
+              <w:rPr>
+                <w:b w:val="0"/>
+                <w:sz w:val="16"/>
+              </w:rPr>
+              <w:t>VM</w:t>
+            </w:r>
+          </w:p>
+        </w:tc>
+        <w:tc>
+          <w:tcPr>
+            <w:tcW w:type="dxa" w:w="2100"/>
+          </w:tcPr>
+          <w:p>
+            <w:pPr>
+              <w:spacing w:before="0" w:after="0" w:line="240" w:lineRule="auto"/>
+            </w:pPr>
+            <w:r>
+              <w:rPr>
+                <w:b w:val="0"/>
+                <w:sz w:val="16"/>
+              </w:rPr>
+              <w:t>Purpose</w:t>
+            </w:r>
+          </w:p>
+        </w:tc>
+        <w:tc>
+          <w:tcPr>
+            <w:tcW w:type="dxa" w:w="900"/>
+          </w:tcPr>
+          <w:p>
+            <w:pPr>
+              <w:spacing w:before="0" w:after="0" w:line="240" w:lineRule="auto"/>
+            </w:pPr>
+            <w:r>
+              <w:rPr>
+                <w:b w:val="0"/>
+                <w:sz w:val="16"/>
+              </w:rPr>
+              <w:t>Server Type</w:t>
+            </w:r>
+          </w:p>
+        </w:tc>
+        <w:tc>
+          <w:tcPr>
+            <w:tcW w:type="dxa" w:w="1900"/>
+          </w:tcPr>
+          <w:p>
+            <w:pPr>
+              <w:spacing w:before="0" w:after="0" w:line="240" w:lineRule="auto"/>
+            </w:pPr>
+            <w:r>
+              <w:rPr>
+                <w:b w:val="0"/>
+                <w:sz w:val="16"/>
+              </w:rPr>
+              <w:t>OS</w:t>
+            </w:r>
+          </w:p>
+        </w:tc>
+        <w:tc>
+          <w:tcPr>
+            <w:tcW w:type="dxa" w:w="1100"/>
+          </w:tcPr>
+          <w:p>
+            <w:pPr>
+              <w:spacing w:before="0" w:after="0" w:line="240" w:lineRule="auto"/>
+            </w:pPr>
+            <w:r>
+              <w:rPr>
+                <w:b w:val="0"/>
+                <w:sz w:val="16"/>
+              </w:rPr>
+              <w:t>vCPU (2.4 GHz or above)</w:t>
+            </w:r>
+          </w:p>
+        </w:tc>
+        <w:tc>
+          <w:tcPr>
+            <w:tcW w:type="dxa" w:w="900"/>
+          </w:tcPr>
+          <w:p>
+            <w:pPr>
+              <w:spacing w:before="0" w:after="0" w:line="240" w:lineRule="auto"/>
+            </w:pPr>
+            <w:r>
+              <w:rPr>
+                <w:b w:val="0"/>
+                <w:sz w:val="16"/>
+              </w:rPr>
+              <w:t>RAM (GB)</w:t>
+            </w:r>
+          </w:p>
+        </w:tc>
+        <w:tc>
+          <w:tcPr>
+            <w:tcW w:type="dxa" w:w="1300"/>
+          </w:tcPr>
+          <w:p>
+            <w:pPr>
+              <w:spacing w:before="0" w:after="0" w:line="240" w:lineRule="auto"/>
+            </w:pPr>
+            <w:r>
+              <w:rPr>
+                <w:b w:val="0"/>
+                <w:sz w:val="16"/>
+              </w:rPr>
+              <w:t>C Drive (GB)</w:t>
+            </w:r>
+          </w:p>
+        </w:tc>
+        <w:tc>
+          <w:tcPr>
+            <w:tcW w:type="dxa" w:w="1448"/>
+          </w:tcPr>
+          <w:p>
+            <w:pPr>
+              <w:spacing w:before="0" w:after="0" w:line="240" w:lineRule="auto"/>
+            </w:pPr>
+            <w:r>
+              <w:rPr>
+                <w:b w:val="0"/>
+                <w:sz w:val="16"/>
+              </w:rPr>
+              <w:t>D Drive (GB)</w:t>
+            </w:r>
+          </w:p>
+        </w:tc>
+      </w:tr>
+      <w:tr>
+        <w:tc>
+          <w:tcPr>
+            <w:tcW w:type="dxa" w:w="10348"/>
+            <w:gridSpan w:val="8"/>
+          </w:tcPr>
+          <w:p>
+            <w:pPr>
+              <w:spacing w:before="0" w:after="0" w:line="240" w:lineRule="auto"/>
+              <w:jc w:val="center"/>
+            </w:pPr>
+            <w:r>
+              <w:rPr>
+                <w:b/>
+                <w:sz w:val="16"/>
+              </w:rPr>
+              <w:t>Production</w:t>
+            </w:r>
+          </w:p>
+        </w:tc>
+      </w:tr>
+      <w:tr>
+        <w:tc>
+          <w:tcPr>
+            <w:tcW w:type="dxa" w:w="700"/>
+          </w:tcPr>
+          <w:p>
+            <w:pPr>
+              <w:spacing w:before="0" w:after="0" w:line="240" w:lineRule="auto"/>
+            </w:pPr>
+            <w:r>
+              <w:rPr>
+                <w:b w:val="0"/>
+                <w:sz w:val="16"/>
+              </w:rPr>
+              <w:t>VM‑1</w:t>
+            </w:r>
+          </w:p>
+        </w:tc>
+        <w:tc>
+          <w:tcPr>
+            <w:tcW w:type="dxa" w:w="2100"/>
+          </w:tcPr>
+          <w:p>
+            <w:pPr>
+              <w:spacing w:before="0" w:after="0" w:line="240" w:lineRule="auto"/>
+            </w:pPr>
+            <w:r>
+              <w:rPr>
+                <w:b w:val="0"/>
+                <w:sz w:val="16"/>
+              </w:rPr>
+              <w:t>TBM‑FF APP</w:t>
+            </w:r>
+          </w:p>
+        </w:tc>
+        <w:tc>
+          <w:tcPr>
+            <w:tcW w:type="dxa" w:w="900"/>
+          </w:tcPr>
+          <w:p>
+            <w:pPr>
+              <w:spacing w:before="0" w:after="0" w:line="240" w:lineRule="auto"/>
+            </w:pPr>
+            <w:r>
+              <w:rPr>
+                <w:b w:val="0"/>
+                <w:sz w:val="16"/>
+              </w:rPr>
+              <w:t>VM</w:t>
+            </w:r>
+          </w:p>
+        </w:tc>
+        <w:tc>
+          <w:tcPr>
+            <w:tcW w:type="dxa" w:w="1900"/>
+          </w:tcPr>
+          <w:p>
+            <w:pPr>
+              <w:spacing w:before="0" w:after="0" w:line="240" w:lineRule="auto"/>
+            </w:pPr>
+            <w:r>
+              <w:rPr>
+                <w:b w:val="0"/>
+                <w:sz w:val="16"/>
+              </w:rPr>
+              <w:t>Windows Server 2022</w:t>
+            </w:r>
+          </w:p>
+        </w:tc>
+        <w:tc>
+          <w:tcPr>
+            <w:tcW w:type="dxa" w:w="1100"/>
+          </w:tcPr>
+          <w:p>
+            <w:pPr>
+              <w:spacing w:before="0" w:after="0" w:line="240" w:lineRule="auto"/>
+            </w:pPr>
+            <w:r>
+              <w:rPr>
+                <w:b w:val="0"/>
+                <w:sz w:val="16"/>
+              </w:rPr>
+              <w:t>12</w:t>
+            </w:r>
+          </w:p>
+        </w:tc>
+        <w:tc>
+          <w:tcPr>
+            <w:tcW w:type="dxa" w:w="900"/>
+          </w:tcPr>
+          <w:p>
+            <w:pPr>
+              <w:spacing w:before="0" w:after="0" w:line="240" w:lineRule="auto"/>
+            </w:pPr>
+            <w:r>
+              <w:rPr>
+                <w:b w:val="0"/>
+                <w:sz w:val="16"/>
+              </w:rPr>
+              <w:t>64</w:t>
+            </w:r>
+          </w:p>
+        </w:tc>
+        <w:tc>
+          <w:tcPr>
+            <w:tcW w:type="dxa" w:w="1300"/>
+          </w:tcPr>
+          <w:p>
+            <w:pPr>
+              <w:spacing w:before="0" w:after="0" w:line="240" w:lineRule="auto"/>
+            </w:pPr>
+            <w:r>
+              <w:rPr>
+                <w:b w:val="0"/>
+                <w:sz w:val="16"/>
+              </w:rPr>
+              <w:t>256</w:t>
+            </w:r>
+          </w:p>
+        </w:tc>
+        <w:tc>
+          <w:tcPr>
+            <w:tcW w:type="dxa" w:w="1448"/>
+          </w:tcPr>
+          <w:p>
+            <w:pPr>
+              <w:spacing w:before="0" w:after="0" w:line="240" w:lineRule="auto"/>
+            </w:pPr>
+            <w:r>
+              <w:rPr>
+                <w:b w:val="0"/>
+                <w:sz w:val="16"/>
+              </w:rPr>
+              <w:t>512</w:t>
+            </w:r>
+          </w:p>
+        </w:tc>
+      </w:tr>
+      <w:tr>
+        <w:tc>
+          <w:tcPr>
+            <w:tcW w:type="dxa" w:w="700"/>
+          </w:tcPr>
+          <w:p>
+            <w:pPr>
+              <w:spacing w:before="0" w:after="0" w:line="240" w:lineRule="auto"/>
+            </w:pPr>
+            <w:r>
+              <w:rPr>
+                <w:b w:val="0"/>
+                <w:sz w:val="16"/>
+              </w:rPr>
+              <w:t>VM‑2</w:t>
+            </w:r>
+          </w:p>
+        </w:tc>
+        <w:tc>
+          <w:tcPr>
+            <w:tcW w:type="dxa" w:w="2100"/>
+          </w:tcPr>
+          <w:p>
+            <w:pPr>
+              <w:spacing w:before="0" w:after="0" w:line="240" w:lineRule="auto"/>
+            </w:pPr>
+            <w:r>
+              <w:rPr>
+                <w:b w:val="0"/>
+                <w:sz w:val="16"/>
+              </w:rPr>
+              <w:t>Testing VM (UAT)</w:t>
+            </w:r>
+          </w:p>
+        </w:tc>
+        <w:tc>
+          <w:tcPr>
+            <w:tcW w:type="dxa" w:w="900"/>
+          </w:tcPr>
+          <w:p>
+            <w:pPr>
+              <w:spacing w:before="0" w:after="0" w:line="240" w:lineRule="auto"/>
+            </w:pPr>
+            <w:r>
+              <w:rPr>
+                <w:b w:val="0"/>
+                <w:sz w:val="16"/>
+              </w:rPr>
+              <w:t>VM</w:t>
+            </w:r>
+          </w:p>
+        </w:tc>
+        <w:tc>
+          <w:tcPr>
+            <w:tcW w:type="dxa" w:w="1900"/>
+          </w:tcPr>
+          <w:p>
+            <w:pPr>
+              <w:spacing w:before="0" w:after="0" w:line="240" w:lineRule="auto"/>
+            </w:pPr>
+            <w:r>
+              <w:rPr>
+                <w:b w:val="0"/>
+                <w:sz w:val="16"/>
+              </w:rPr>
+              <w:t>Windows Server 2022</w:t>
+            </w:r>
+          </w:p>
+        </w:tc>
+        <w:tc>
+          <w:tcPr>
+            <w:tcW w:type="dxa" w:w="1100"/>
+          </w:tcPr>
+          <w:p>
+            <w:pPr>
+              <w:spacing w:before="0" w:after="0" w:line="240" w:lineRule="auto"/>
+            </w:pPr>
+            <w:r>
+              <w:rPr>
+                <w:b w:val="0"/>
+                <w:sz w:val="16"/>
+              </w:rPr>
+              <w:t>8</w:t>
+            </w:r>
+          </w:p>
+        </w:tc>
+        <w:tc>
+          <w:tcPr>
+            <w:tcW w:type="dxa" w:w="900"/>
+          </w:tcPr>
+          <w:p>
+            <w:pPr>
+              <w:spacing w:before="0" w:after="0" w:line="240" w:lineRule="auto"/>
+            </w:pPr>
+            <w:r>
+              <w:rPr>
+                <w:b w:val="0"/>
+                <w:sz w:val="16"/>
+              </w:rPr>
+              <w:t>48</w:t>
+            </w:r>
+          </w:p>
+        </w:tc>
+        <w:tc>
+          <w:tcPr>
+            <w:tcW w:type="dxa" w:w="1300"/>
+          </w:tcPr>
+          <w:p>
+            <w:pPr>
+              <w:spacing w:before="0" w:after="0" w:line="240" w:lineRule="auto"/>
+            </w:pPr>
+            <w:r>
+              <w:rPr>
+                <w:b w:val="0"/>
+                <w:sz w:val="16"/>
+              </w:rPr>
+              <w:t>256</w:t>
+            </w:r>
+          </w:p>
+        </w:tc>
+        <w:tc>
+          <w:tcPr>
+            <w:tcW w:type="dxa" w:w="1448"/>
+          </w:tcPr>
+          <w:p>
+            <w:pPr>
+              <w:spacing w:before="0" w:after="0" w:line="240" w:lineRule="auto"/>
+            </w:pPr>
+            <w:r>
+              <w:rPr>
+                <w:b w:val="0"/>
+                <w:sz w:val="16"/>
+              </w:rPr>
+              <w:t>512</w:t>
+            </w:r>
+          </w:p>
+        </w:tc>
+      </w:tr>
+      <w:tr>
+        <w:tc>
+          <w:tcPr>
+            <w:tcW w:type="dxa" w:w="700"/>
+          </w:tcPr>
+          <w:p>
+            <w:pPr>
+              <w:spacing w:before="0" w:after="0" w:line="240" w:lineRule="auto"/>
+            </w:pPr>
+            <w:r>
+              <w:rPr>
+                <w:b w:val="0"/>
+                <w:sz w:val="16"/>
+              </w:rPr>
+              <w:t>VM‑3</w:t>
+            </w:r>
+          </w:p>
+        </w:tc>
+        <w:tc>
+          <w:tcPr>
+            <w:tcW w:type="dxa" w:w="2100"/>
+          </w:tcPr>
+          <w:p>
+            <w:pPr>
+              <w:spacing w:before="0" w:after="0" w:line="240" w:lineRule="auto"/>
+            </w:pPr>
+            <w:r>
+              <w:rPr>
+                <w:b w:val="0"/>
+                <w:sz w:val="16"/>
+              </w:rPr>
+              <w:t>DB VM</w:t>
+            </w:r>
+          </w:p>
+        </w:tc>
+        <w:tc>
+          <w:tcPr>
+            <w:tcW w:type="dxa" w:w="900"/>
+          </w:tcPr>
+          <w:p>
+            <w:pPr>
+              <w:spacing w:before="0" w:after="0" w:line="240" w:lineRule="auto"/>
+            </w:pPr>
+            <w:r>
+              <w:rPr>
+                <w:b w:val="0"/>
+                <w:sz w:val="16"/>
+              </w:rPr>
+              <w:t>VM</w:t>
+            </w:r>
+          </w:p>
+        </w:tc>
+        <w:tc>
+          <w:tcPr>
+            <w:tcW w:type="dxa" w:w="1900"/>
+          </w:tcPr>
+          <w:p>
+            <w:pPr>
+              <w:spacing w:before="0" w:after="0" w:line="240" w:lineRule="auto"/>
+            </w:pPr>
+            <w:r>
+              <w:rPr>
+                <w:b w:val="0"/>
+                <w:sz w:val="16"/>
+              </w:rPr>
+              <w:t>Windows Server 2022</w:t>
+            </w:r>
+          </w:p>
+        </w:tc>
+        <w:tc>
+          <w:tcPr>
+            <w:tcW w:type="dxa" w:w="1100"/>
+          </w:tcPr>
+          <w:p>
+            <w:pPr>
+              <w:spacing w:before="0" w:after="0" w:line="240" w:lineRule="auto"/>
+            </w:pPr>
+            <w:r>
+              <w:rPr>
+                <w:b w:val="0"/>
+                <w:sz w:val="16"/>
+              </w:rPr>
+              <w:t>16</w:t>
+            </w:r>
+          </w:p>
+        </w:tc>
+        <w:tc>
+          <w:tcPr>
+            <w:tcW w:type="dxa" w:w="900"/>
+          </w:tcPr>
+          <w:p>
+            <w:pPr>
+              <w:spacing w:before="0" w:after="0" w:line="240" w:lineRule="auto"/>
+            </w:pPr>
+            <w:r>
+              <w:rPr>
+                <w:b w:val="0"/>
+                <w:sz w:val="16"/>
+              </w:rPr>
+              <w:t>192</w:t>
+            </w:r>
+          </w:p>
+        </w:tc>
+        <w:tc>
+          <w:tcPr>
+            <w:tcW w:type="dxa" w:w="1300"/>
+          </w:tcPr>
+          <w:p>
+            <w:pPr>
+              <w:spacing w:before="0" w:after="0" w:line="240" w:lineRule="auto"/>
+            </w:pPr>
+            <w:r>
+              <w:rPr>
+                <w:b w:val="0"/>
+                <w:sz w:val="16"/>
+              </w:rPr>
+              <w:t>256</w:t>
+            </w:r>
+          </w:p>
+        </w:tc>
+        <w:tc>
+          <w:tcPr>
+            <w:tcW w:type="dxa" w:w="1448"/>
+          </w:tcPr>
+          <w:p>
+            <w:pPr>
+              <w:spacing w:before="0" w:after="0" w:line="240" w:lineRule="auto"/>
+            </w:pPr>
+            <w:r>
+              <w:rPr>
+                <w:b w:val="0"/>
+                <w:sz w:val="16"/>
+              </w:rPr>
+              <w:t>2048</w:t>
+            </w:r>
+          </w:p>
+        </w:tc>
+      </w:tr>
+      <w:tr>
+        <w:tc>
+          <w:tcPr>
+            <w:tcW w:type="dxa" w:w="700"/>
+          </w:tcPr>
+          <w:p>
+            <w:pPr>
+              <w:spacing w:before="0" w:after="0" w:line="240" w:lineRule="auto"/>
+            </w:pPr>
+            <w:r>
+              <w:rPr>
+                <w:b w:val="0"/>
+                <w:sz w:val="16"/>
+              </w:rPr>
+              <w:t>VM‑4</w:t>
+            </w:r>
+          </w:p>
+        </w:tc>
+        <w:tc>
+          <w:tcPr>
+            <w:tcW w:type="dxa" w:w="2100"/>
+          </w:tcPr>
+          <w:p>
+            <w:pPr>
+              <w:spacing w:before="0" w:after="0" w:line="240" w:lineRule="auto"/>
+            </w:pPr>
+            <w:r>
+              <w:rPr>
+                <w:b w:val="0"/>
+                <w:sz w:val="16"/>
+              </w:rPr>
+              <w:t>RMS‑TBM (Future)</w:t>
+            </w:r>
+          </w:p>
+        </w:tc>
+        <w:tc>
+          <w:tcPr>
+            <w:tcW w:type="dxa" w:w="900"/>
+          </w:tcPr>
+          <w:p>
+            <w:pPr>
+              <w:spacing w:before="0" w:after="0" w:line="240" w:lineRule="auto"/>
+            </w:pPr>
+            <w:r>
+              <w:rPr>
+                <w:b w:val="0"/>
+                <w:sz w:val="16"/>
+              </w:rPr>
+              <w:t>VM</w:t>
+            </w:r>
+          </w:p>
+        </w:tc>
+        <w:tc>
+          <w:tcPr>
+            <w:tcW w:type="dxa" w:w="1900"/>
+          </w:tcPr>
+          <w:p>
+            <w:pPr>
+              <w:spacing w:before="0" w:after="0" w:line="240" w:lineRule="auto"/>
+            </w:pPr>
+            <w:r>
+              <w:rPr>
+                <w:b w:val="0"/>
+                <w:sz w:val="16"/>
+              </w:rPr>
+              <w:t>Windows Server 2022</w:t>
+            </w:r>
+          </w:p>
+        </w:tc>
+        <w:tc>
+          <w:tcPr>
+            <w:tcW w:type="dxa" w:w="1100"/>
+          </w:tcPr>
+          <w:p>
+            <w:pPr>
+              <w:spacing w:before="0" w:after="0" w:line="240" w:lineRule="auto"/>
+            </w:pPr>
+            <w:r>
+              <w:rPr>
+                <w:b w:val="0"/>
+                <w:sz w:val="16"/>
+              </w:rPr>
+              <w:t>12</w:t>
+            </w:r>
+          </w:p>
+        </w:tc>
+        <w:tc>
+          <w:tcPr>
+            <w:tcW w:type="dxa" w:w="900"/>
+          </w:tcPr>
+          <w:p>
+            <w:pPr>
+              <w:spacing w:before="0" w:after="0" w:line="240" w:lineRule="auto"/>
+            </w:pPr>
+            <w:r>
+              <w:rPr>
+                <w:b w:val="0"/>
+                <w:sz w:val="16"/>
+              </w:rPr>
+              <w:t>64</w:t>
+            </w:r>
+          </w:p>
+        </w:tc>
+        <w:tc>
+          <w:tcPr>
+            <w:tcW w:type="dxa" w:w="1300"/>
+          </w:tcPr>
+          <w:p>
+            <w:pPr>
+              <w:spacing w:before="0" w:after="0" w:line="240" w:lineRule="auto"/>
+            </w:pPr>
+            <w:r>
+              <w:rPr>
+                <w:b w:val="0"/>
+                <w:sz w:val="16"/>
+              </w:rPr>
+              <w:t>256</w:t>
+            </w:r>
+          </w:p>
+        </w:tc>
+        <w:tc>
+          <w:tcPr>
+            <w:tcW w:type="dxa" w:w="1448"/>
+          </w:tcPr>
+          <w:p>
+            <w:pPr>
+              <w:spacing w:before="0" w:after="0" w:line="240" w:lineRule="auto"/>
+            </w:pPr>
+            <w:r>
+              <w:rPr>
+                <w:b w:val="0"/>
+                <w:sz w:val="16"/>
+              </w:rPr>
+              <w:t>512</w:t>
+            </w:r>
+          </w:p>
+        </w:tc>
+      </w:tr>
+      <w:tr>
+        <w:tc>
+          <w:tcPr>
+            <w:tcW w:type="dxa" w:w="10348"/>
+            <w:gridSpan w:val="8"/>
+          </w:tcPr>
+          <w:p>
+            <w:pPr>
+              <w:spacing w:before="0" w:after="0" w:line="240" w:lineRule="auto"/>
+              <w:jc w:val="center"/>
+            </w:pPr>
+            <w:r>
+              <w:rPr>
+                <w:b/>
+                <w:sz w:val="16"/>
+              </w:rPr>
+              <w:t>10 % additional compute for future enhancement</w:t>
+            </w:r>
+          </w:p>
+        </w:tc>
+      </w:tr>
+      <w:tr>
+        <w:tc>
+          <w:tcPr>
+            <w:tcW w:type="dxa" w:w="700"/>
+          </w:tcPr>
+          <w:p>
+            <w:pPr>
+              <w:spacing w:before="0" w:after="0" w:line="240" w:lineRule="auto"/>
+            </w:pPr>
+            <w:r>
+              <w:rPr>
+                <w:b/>
+                <w:sz w:val="16"/>
+              </w:rPr>
+            </w:r>
+          </w:p>
+        </w:tc>
+        <w:tc>
+          <w:tcPr>
+            <w:tcW w:type="dxa" w:w="2100"/>
+          </w:tcPr>
+          <w:p>
+            <w:pPr>
+              <w:spacing w:before="0" w:after="0" w:line="240" w:lineRule="auto"/>
+            </w:pPr>
+            <w:r>
+              <w:rPr>
+                <w:b/>
+                <w:sz w:val="16"/>
+              </w:rPr>
+              <w:t>Overall Required Resources</w:t>
+            </w:r>
+          </w:p>
+        </w:tc>
+        <w:tc>
+          <w:tcPr>
+            <w:tcW w:type="dxa" w:w="900"/>
+          </w:tcPr>
+          <w:p>
+            <w:pPr>
+              <w:spacing w:before="0" w:after="0" w:line="240" w:lineRule="auto"/>
+            </w:pPr>
+            <w:r>
+              <w:rPr>
+                <w:b/>
+                <w:sz w:val="16"/>
+              </w:rPr>
+            </w:r>
+          </w:p>
+        </w:tc>
+        <w:tc>
+          <w:tcPr>
+            <w:tcW w:type="dxa" w:w="1900"/>
+          </w:tcPr>
+          <w:p>
+            <w:pPr>
+              <w:spacing w:before="0" w:after="0" w:line="240" w:lineRule="auto"/>
+            </w:pPr>
+            <w:r>
+              <w:rPr>
+                <w:b/>
+                <w:sz w:val="16"/>
+              </w:rPr>
+            </w:r>
+          </w:p>
+        </w:tc>
+        <w:tc>
+          <w:tcPr>
+            <w:tcW w:type="dxa" w:w="1100"/>
+          </w:tcPr>
+          <w:p>
+            <w:pPr>
+              <w:spacing w:before="0" w:after="0" w:line="240" w:lineRule="auto"/>
+            </w:pPr>
+            <w:r>
+              <w:rPr>
+                <w:b/>
+                <w:sz w:val="16"/>
+              </w:rPr>
+              <w:t>48</w:t>
+            </w:r>
+          </w:p>
+        </w:tc>
+        <w:tc>
+          <w:tcPr>
+            <w:tcW w:type="dxa" w:w="900"/>
+          </w:tcPr>
+          <w:p>
+            <w:pPr>
+              <w:spacing w:before="0" w:after="0" w:line="240" w:lineRule="auto"/>
+            </w:pPr>
+            <w:r>
+              <w:rPr>
+                <w:b/>
+                <w:sz w:val="16"/>
+              </w:rPr>
+              <w:t>368</w:t>
+            </w:r>
+          </w:p>
+        </w:tc>
+        <w:tc>
+          <w:tcPr>
+            <w:tcW w:type="dxa" w:w="1300"/>
+          </w:tcPr>
+          <w:p>
+            <w:pPr>
+              <w:spacing w:before="0" w:after="0" w:line="240" w:lineRule="auto"/>
+            </w:pPr>
+            <w:r>
+              <w:rPr>
+                <w:b/>
+                <w:sz w:val="16"/>
+              </w:rPr>
+              <w:t>1024</w:t>
+            </w:r>
+          </w:p>
+        </w:tc>
+        <w:tc>
+          <w:tcPr>
+            <w:tcW w:type="dxa" w:w="1448"/>
+          </w:tcPr>
+          <w:p>
+            <w:pPr>
+              <w:spacing w:before="0" w:after="0" w:line="240" w:lineRule="auto"/>
+            </w:pPr>
+            <w:r>
+              <w:rPr>
+                <w:b/>
+                <w:sz w:val="16"/>
+              </w:rPr>
+              <w:t>3584</w:t>
+            </w:r>
+          </w:p>
+        </w:tc>
+      </w:tr>
+      <w:tr>
+        <w:tc>
+          <w:tcPr>
+            <w:tcW w:type="dxa" w:w="10348"/>
+            <w:gridSpan w:val="8"/>
+          </w:tcPr>
+          <w:p>
+            <w:pPr>
+              <w:spacing w:before="0" w:after="0" w:line="240" w:lineRule="auto"/>
+              <w:jc w:val="center"/>
+            </w:pPr>
+            <w:r>
+              <w:rPr>
+                <w:b/>
+                <w:sz w:val="16"/>
+              </w:rPr>
+              <w:t>DR</w:t>
+            </w:r>
+          </w:p>
+        </w:tc>
+      </w:tr>
+      <w:tr>
+        <w:tc>
+          <w:tcPr>
+            <w:tcW w:type="dxa" w:w="700"/>
+          </w:tcPr>
+          <w:p>
+            <w:pPr>
+              <w:spacing w:before="0" w:after="0" w:line="240" w:lineRule="auto"/>
+            </w:pPr>
+            <w:r>
+              <w:rPr>
+                <w:b w:val="0"/>
+                <w:sz w:val="16"/>
+              </w:rPr>
+              <w:t>VM‑1</w:t>
+            </w:r>
+          </w:p>
+        </w:tc>
+        <w:tc>
+          <w:tcPr>
+            <w:tcW w:type="dxa" w:w="2100"/>
+          </w:tcPr>
+          <w:p>
+            <w:pPr>
+              <w:spacing w:before="0" w:after="0" w:line="240" w:lineRule="auto"/>
+            </w:pPr>
+            <w:r>
+              <w:rPr>
+                <w:b w:val="0"/>
+                <w:sz w:val="16"/>
+              </w:rPr>
+              <w:t>TBM‑FF APP</w:t>
+            </w:r>
+          </w:p>
+        </w:tc>
+        <w:tc>
+          <w:tcPr>
+            <w:tcW w:type="dxa" w:w="900"/>
+          </w:tcPr>
+          <w:p>
+            <w:pPr>
+              <w:spacing w:before="0" w:after="0" w:line="240" w:lineRule="auto"/>
+            </w:pPr>
+            <w:r>
+              <w:rPr>
+                <w:b w:val="0"/>
+                <w:sz w:val="16"/>
+              </w:rPr>
+              <w:t>VM</w:t>
+            </w:r>
+          </w:p>
+        </w:tc>
+        <w:tc>
+          <w:tcPr>
+            <w:tcW w:type="dxa" w:w="1900"/>
+          </w:tcPr>
+          <w:p>
+            <w:pPr>
+              <w:spacing w:before="0" w:after="0" w:line="240" w:lineRule="auto"/>
+            </w:pPr>
+            <w:r>
+              <w:rPr>
+                <w:b w:val="0"/>
+                <w:sz w:val="16"/>
+              </w:rPr>
+              <w:t>Windows Server 2022</w:t>
+            </w:r>
+          </w:p>
+        </w:tc>
+        <w:tc>
+          <w:tcPr>
+            <w:tcW w:type="dxa" w:w="1100"/>
+          </w:tcPr>
+          <w:p>
+            <w:pPr>
+              <w:spacing w:before="0" w:after="0" w:line="240" w:lineRule="auto"/>
+            </w:pPr>
+            <w:r>
+              <w:rPr>
+                <w:b w:val="0"/>
+                <w:sz w:val="16"/>
+              </w:rPr>
+              <w:t>12</w:t>
+            </w:r>
+          </w:p>
+        </w:tc>
+        <w:tc>
+          <w:tcPr>
+            <w:tcW w:type="dxa" w:w="900"/>
+          </w:tcPr>
+          <w:p>
+            <w:pPr>
+              <w:spacing w:before="0" w:after="0" w:line="240" w:lineRule="auto"/>
+            </w:pPr>
+            <w:r>
+              <w:rPr>
+                <w:b w:val="0"/>
+                <w:sz w:val="16"/>
+              </w:rPr>
+              <w:t>64</w:t>
+            </w:r>
+          </w:p>
+        </w:tc>
+        <w:tc>
+          <w:tcPr>
+            <w:tcW w:type="dxa" w:w="1300"/>
+          </w:tcPr>
+          <w:p>
+            <w:pPr>
+              <w:spacing w:before="0" w:after="0" w:line="240" w:lineRule="auto"/>
+            </w:pPr>
+            <w:r>
+              <w:rPr>
+                <w:b w:val="0"/>
+                <w:sz w:val="16"/>
+              </w:rPr>
+              <w:t>256</w:t>
+            </w:r>
+          </w:p>
+        </w:tc>
+        <w:tc>
+          <w:tcPr>
+            <w:tcW w:type="dxa" w:w="1448"/>
+          </w:tcPr>
+          <w:p>
+            <w:pPr>
+              <w:spacing w:before="0" w:after="0" w:line="240" w:lineRule="auto"/>
+            </w:pPr>
+            <w:r>
+              <w:rPr>
+                <w:b w:val="0"/>
+                <w:sz w:val="16"/>
+              </w:rPr>
+              <w:t>512</w:t>
+            </w:r>
+          </w:p>
+        </w:tc>
+      </w:tr>
+      <w:tr>
+        <w:tc>
+          <w:tcPr>
+            <w:tcW w:type="dxa" w:w="700"/>
+          </w:tcPr>
+          <w:p>
+            <w:pPr>
+              <w:spacing w:before="0" w:after="0" w:line="240" w:lineRule="auto"/>
+            </w:pPr>
+            <w:r>
+              <w:rPr>
+                <w:b w:val="0"/>
+                <w:sz w:val="16"/>
+              </w:rPr>
+              <w:t>VM‑2</w:t>
+            </w:r>
+          </w:p>
+        </w:tc>
+        <w:tc>
+          <w:tcPr>
+            <w:tcW w:type="dxa" w:w="2100"/>
+          </w:tcPr>
+          <w:p>
+            <w:pPr>
+              <w:spacing w:before="0" w:after="0" w:line="240" w:lineRule="auto"/>
+            </w:pPr>
+            <w:r>
+              <w:rPr>
+                <w:b w:val="0"/>
+                <w:sz w:val="16"/>
+              </w:rPr>
+              <w:t>Testing VM (UAT)</w:t>
+            </w:r>
+          </w:p>
+        </w:tc>
+        <w:tc>
+          <w:tcPr>
+            <w:tcW w:type="dxa" w:w="900"/>
+          </w:tcPr>
+          <w:p>
+            <w:pPr>
+              <w:spacing w:before="0" w:after="0" w:line="240" w:lineRule="auto"/>
+            </w:pPr>
+            <w:r>
+              <w:rPr>
+                <w:b w:val="0"/>
+                <w:sz w:val="16"/>
+              </w:rPr>
+              <w:t>VM</w:t>
+            </w:r>
+          </w:p>
+        </w:tc>
+        <w:tc>
+          <w:tcPr>
+            <w:tcW w:type="dxa" w:w="1900"/>
+          </w:tcPr>
+          <w:p>
+            <w:pPr>
+              <w:spacing w:before="0" w:after="0" w:line="240" w:lineRule="auto"/>
+            </w:pPr>
+            <w:r>
+              <w:rPr>
+                <w:b w:val="0"/>
+                <w:sz w:val="16"/>
+              </w:rPr>
+              <w:t>Windows Server 2022</w:t>
+            </w:r>
+          </w:p>
+        </w:tc>
+        <w:tc>
+          <w:tcPr>
+            <w:tcW w:type="dxa" w:w="1100"/>
+          </w:tcPr>
+          <w:p>
+            <w:pPr>
+              <w:spacing w:before="0" w:after="0" w:line="240" w:lineRule="auto"/>
+            </w:pPr>
+            <w:r>
+              <w:rPr>
+                <w:b w:val="0"/>
+                <w:sz w:val="16"/>
+              </w:rPr>
+              <w:t>8</w:t>
+            </w:r>
+          </w:p>
+        </w:tc>
+        <w:tc>
+          <w:tcPr>
+            <w:tcW w:type="dxa" w:w="900"/>
+          </w:tcPr>
+          <w:p>
+            <w:pPr>
+              <w:spacing w:before="0" w:after="0" w:line="240" w:lineRule="auto"/>
+            </w:pPr>
+            <w:r>
+              <w:rPr>
+                <w:b w:val="0"/>
+                <w:sz w:val="16"/>
+              </w:rPr>
+              <w:t>48</w:t>
+            </w:r>
+          </w:p>
+        </w:tc>
+        <w:tc>
+          <w:tcPr>
+            <w:tcW w:type="dxa" w:w="1300"/>
+          </w:tcPr>
+          <w:p>
+            <w:pPr>
+              <w:spacing w:before="0" w:after="0" w:line="240" w:lineRule="auto"/>
+            </w:pPr>
+            <w:r>
+              <w:rPr>
+                <w:b w:val="0"/>
+                <w:sz w:val="16"/>
+              </w:rPr>
+              <w:t>256</w:t>
+            </w:r>
+          </w:p>
+        </w:tc>
+        <w:tc>
+          <w:tcPr>
+            <w:tcW w:type="dxa" w:w="1448"/>
+          </w:tcPr>
+          <w:p>
+            <w:pPr>
+              <w:spacing w:before="0" w:after="0" w:line="240" w:lineRule="auto"/>
+            </w:pPr>
+            <w:r>
+              <w:rPr>
+                <w:b w:val="0"/>
+                <w:sz w:val="16"/>
+              </w:rPr>
+              <w:t>512</w:t>
+            </w:r>
+          </w:p>
+        </w:tc>
+      </w:tr>
+      <w:tr>
+        <w:tc>
+          <w:tcPr>
+            <w:tcW w:type="dxa" w:w="700"/>
+          </w:tcPr>
+          <w:p>
+            <w:pPr>
+              <w:spacing w:before="0" w:after="0" w:line="240" w:lineRule="auto"/>
+            </w:pPr>
+            <w:r>
+              <w:rPr>
+                <w:b w:val="0"/>
+                <w:sz w:val="16"/>
+              </w:rPr>
+              <w:t>VM‑3</w:t>
+            </w:r>
+          </w:p>
+        </w:tc>
+        <w:tc>
+          <w:tcPr>
+            <w:tcW w:type="dxa" w:w="2100"/>
+          </w:tcPr>
+          <w:p>
+            <w:pPr>
+              <w:spacing w:before="0" w:after="0" w:line="240" w:lineRule="auto"/>
+            </w:pPr>
+            <w:r>
+              <w:rPr>
+                <w:b w:val="0"/>
+                <w:sz w:val="16"/>
+              </w:rPr>
+              <w:t>DB VM</w:t>
+            </w:r>
+          </w:p>
+        </w:tc>
+        <w:tc>
+          <w:tcPr>
+            <w:tcW w:type="dxa" w:w="900"/>
+          </w:tcPr>
+          <w:p>
+            <w:pPr>
+              <w:spacing w:before="0" w:after="0" w:line="240" w:lineRule="auto"/>
+            </w:pPr>
+            <w:r>
+              <w:rPr>
+                <w:b w:val="0"/>
+                <w:sz w:val="16"/>
+              </w:rPr>
+              <w:t>VM</w:t>
+            </w:r>
+          </w:p>
+        </w:tc>
+        <w:tc>
+          <w:tcPr>
+            <w:tcW w:type="dxa" w:w="1900"/>
+          </w:tcPr>
+          <w:p>
+            <w:pPr>
+              <w:spacing w:before="0" w:after="0" w:line="240" w:lineRule="auto"/>
+            </w:pPr>
+            <w:r>
+              <w:rPr>
+                <w:b w:val="0"/>
+                <w:sz w:val="16"/>
+              </w:rPr>
+              <w:t>Windows Server 2022</w:t>
+            </w:r>
+          </w:p>
+        </w:tc>
+        <w:tc>
+          <w:tcPr>
+            <w:tcW w:type="dxa" w:w="1100"/>
+          </w:tcPr>
+          <w:p>
+            <w:pPr>
+              <w:spacing w:before="0" w:after="0" w:line="240" w:lineRule="auto"/>
+            </w:pPr>
+            <w:r>
+              <w:rPr>
+                <w:b w:val="0"/>
+                <w:sz w:val="16"/>
+              </w:rPr>
+              <w:t>16</w:t>
+            </w:r>
+          </w:p>
+        </w:tc>
+        <w:tc>
+          <w:tcPr>
+            <w:tcW w:type="dxa" w:w="900"/>
+          </w:tcPr>
+          <w:p>
+            <w:pPr>
+              <w:spacing w:before="0" w:after="0" w:line="240" w:lineRule="auto"/>
+            </w:pPr>
+            <w:r>
+              <w:rPr>
+                <w:b w:val="0"/>
+                <w:sz w:val="16"/>
+              </w:rPr>
+              <w:t>192</w:t>
+            </w:r>
+          </w:p>
+        </w:tc>
+        <w:tc>
+          <w:tcPr>
+            <w:tcW w:type="dxa" w:w="1300"/>
+          </w:tcPr>
+          <w:p>
+            <w:pPr>
+              <w:spacing w:before="0" w:after="0" w:line="240" w:lineRule="auto"/>
+            </w:pPr>
+            <w:r>
+              <w:rPr>
+                <w:b w:val="0"/>
+                <w:sz w:val="16"/>
+              </w:rPr>
+              <w:t>256</w:t>
+            </w:r>
+          </w:p>
+        </w:tc>
+        <w:tc>
+          <w:tcPr>
+            <w:tcW w:type="dxa" w:w="1448"/>
+          </w:tcPr>
+          <w:p>
+            <w:pPr>
+              <w:spacing w:before="0" w:after="0" w:line="240" w:lineRule="auto"/>
+            </w:pPr>
+            <w:r>
+              <w:rPr>
+                <w:b w:val="0"/>
+                <w:sz w:val="16"/>
+              </w:rPr>
+              <w:t>2048</w:t>
+            </w:r>
+          </w:p>
+        </w:tc>
+      </w:tr>
+      <w:tr>
+        <w:tc>
+          <w:tcPr>
+            <w:tcW w:type="dxa" w:w="700"/>
+          </w:tcPr>
+          <w:p>
+            <w:pPr>
+              <w:spacing w:before="0" w:after="0" w:line="240" w:lineRule="auto"/>
+            </w:pPr>
+            <w:r>
+              <w:rPr>
+                <w:b w:val="0"/>
+                <w:sz w:val="16"/>
+              </w:rPr>
+              <w:t>VM‑4</w:t>
+            </w:r>
+          </w:p>
+        </w:tc>
+        <w:tc>
+          <w:tcPr>
+            <w:tcW w:type="dxa" w:w="2100"/>
+          </w:tcPr>
+          <w:p>
+            <w:pPr>
+              <w:spacing w:before="0" w:after="0" w:line="240" w:lineRule="auto"/>
+            </w:pPr>
+            <w:r>
+              <w:rPr>
+                <w:b w:val="0"/>
+                <w:sz w:val="16"/>
+              </w:rPr>
+              <w:t>RMS‑TBM (Future)</w:t>
+            </w:r>
+          </w:p>
+        </w:tc>
+        <w:tc>
+          <w:tcPr>
+            <w:tcW w:type="dxa" w:w="900"/>
+          </w:tcPr>
+          <w:p>
+            <w:pPr>
+              <w:spacing w:before="0" w:after="0" w:line="240" w:lineRule="auto"/>
+            </w:pPr>
+            <w:r>
+              <w:rPr>
+                <w:b w:val="0"/>
+                <w:sz w:val="16"/>
+              </w:rPr>
+              <w:t>VM</w:t>
+            </w:r>
+          </w:p>
+        </w:tc>
+        <w:tc>
+          <w:tcPr>
+            <w:tcW w:type="dxa" w:w="1900"/>
+          </w:tcPr>
+          <w:p>
+            <w:pPr>
+              <w:spacing w:before="0" w:after="0" w:line="240" w:lineRule="auto"/>
+            </w:pPr>
+            <w:r>
+              <w:rPr>
+                <w:b w:val="0"/>
+                <w:sz w:val="16"/>
+              </w:rPr>
+              <w:t>Windows Server 2022</w:t>
+            </w:r>
+          </w:p>
+        </w:tc>
+        <w:tc>
+          <w:tcPr>
+            <w:tcW w:type="dxa" w:w="1100"/>
+          </w:tcPr>
+          <w:p>
+            <w:pPr>
+              <w:spacing w:before="0" w:after="0" w:line="240" w:lineRule="auto"/>
+            </w:pPr>
+            <w:r>
+              <w:rPr>
+                <w:b w:val="0"/>
+                <w:sz w:val="16"/>
+              </w:rPr>
+              <w:t>12</w:t>
+            </w:r>
+          </w:p>
+        </w:tc>
+        <w:tc>
+          <w:tcPr>
+            <w:tcW w:type="dxa" w:w="900"/>
+          </w:tcPr>
+          <w:p>
+            <w:pPr>
+              <w:spacing w:before="0" w:after="0" w:line="240" w:lineRule="auto"/>
+            </w:pPr>
+            <w:r>
+              <w:rPr>
+                <w:b w:val="0"/>
+                <w:sz w:val="16"/>
+              </w:rPr>
+              <w:t>64</w:t>
+            </w:r>
+          </w:p>
+        </w:tc>
+        <w:tc>
+          <w:tcPr>
+            <w:tcW w:type="dxa" w:w="1300"/>
+          </w:tcPr>
+          <w:p>
+            <w:pPr>
+              <w:spacing w:before="0" w:after="0" w:line="240" w:lineRule="auto"/>
+            </w:pPr>
+            <w:r>
+              <w:rPr>
+                <w:b w:val="0"/>
+                <w:sz w:val="16"/>
+              </w:rPr>
+              <w:t>256</w:t>
+            </w:r>
+          </w:p>
+        </w:tc>
+        <w:tc>
+          <w:tcPr>
+            <w:tcW w:type="dxa" w:w="1448"/>
+          </w:tcPr>
+          <w:p>
+            <w:pPr>
+              <w:spacing w:before="0" w:after="0" w:line="240" w:lineRule="auto"/>
+            </w:pPr>
+            <w:r>
+              <w:rPr>
+                <w:b w:val="0"/>
+                <w:sz w:val="16"/>
+              </w:rPr>
+              <w:t>512</w:t>
+            </w:r>
+          </w:p>
+        </w:tc>
+      </w:tr>
+      <w:tr>
+        <w:tc>
+          <w:tcPr>
+            <w:tcW w:type="dxa" w:w="10348"/>
+            <w:gridSpan w:val="8"/>
+          </w:tcPr>
+          <w:p>
+            <w:pPr>
+              <w:spacing w:before="0" w:after="0" w:line="240" w:lineRule="auto"/>
+              <w:jc w:val="center"/>
+            </w:pPr>
+            <w:r>
+              <w:rPr>
+                <w:b/>
+                <w:sz w:val="16"/>
+              </w:rPr>
+              <w:t>10 % additional compute for future enhancement</w:t>
+            </w:r>
+          </w:p>
+        </w:tc>
+      </w:tr>
+      <w:tr>
+        <w:tc>
+          <w:tcPr>
+            <w:tcW w:type="dxa" w:w="700"/>
+          </w:tcPr>
+          <w:p>
+            <w:pPr>
+              <w:spacing w:before="0" w:after="0" w:line="240" w:lineRule="auto"/>
+            </w:pPr>
+            <w:r>
+              <w:rPr>
+                <w:b/>
+                <w:sz w:val="16"/>
+              </w:rPr>
+            </w:r>
+          </w:p>
+        </w:tc>
+        <w:tc>
+          <w:tcPr>
+            <w:tcW w:type="dxa" w:w="2100"/>
+          </w:tcPr>
+          <w:p>
+            <w:pPr>
+              <w:spacing w:before="0" w:after="0" w:line="240" w:lineRule="auto"/>
+            </w:pPr>
+            <w:r>
+              <w:rPr>
+                <w:b/>
+                <w:sz w:val="16"/>
+              </w:rPr>
+              <w:t>Overall Required Resources</w:t>
+            </w:r>
+          </w:p>
+        </w:tc>
+        <w:tc>
+          <w:tcPr>
+            <w:tcW w:type="dxa" w:w="900"/>
+          </w:tcPr>
+          <w:p>
+            <w:pPr>
+              <w:spacing w:before="0" w:after="0" w:line="240" w:lineRule="auto"/>
+            </w:pPr>
+            <w:r>
+              <w:rPr>
+                <w:b/>
+                <w:sz w:val="16"/>
+              </w:rPr>
+            </w:r>
+          </w:p>
+        </w:tc>
+        <w:tc>
+          <w:tcPr>
+            <w:tcW w:type="dxa" w:w="1900"/>
+          </w:tcPr>
+          <w:p>
+            <w:pPr>
+              <w:spacing w:before="0" w:after="0" w:line="240" w:lineRule="auto"/>
+            </w:pPr>
+            <w:r>
+              <w:rPr>
+                <w:b/>
+                <w:sz w:val="16"/>
+              </w:rPr>
+            </w:r>
+          </w:p>
+        </w:tc>
+        <w:tc>
+          <w:tcPr>
+            <w:tcW w:type="dxa" w:w="1100"/>
+          </w:tcPr>
+          <w:p>
+            <w:pPr>
+              <w:spacing w:before="0" w:after="0" w:line="240" w:lineRule="auto"/>
+            </w:pPr>
+            <w:r>
+              <w:rPr>
+                <w:b/>
+                <w:sz w:val="16"/>
+              </w:rPr>
+              <w:t>48</w:t>
+            </w:r>
+          </w:p>
+        </w:tc>
+        <w:tc>
+          <w:tcPr>
+            <w:tcW w:type="dxa" w:w="900"/>
+          </w:tcPr>
+          <w:p>
+            <w:pPr>
+              <w:spacing w:before="0" w:after="0" w:line="240" w:lineRule="auto"/>
+            </w:pPr>
+            <w:r>
+              <w:rPr>
+                <w:b/>
+                <w:sz w:val="16"/>
+              </w:rPr>
+              <w:t>368</w:t>
+            </w:r>
+          </w:p>
+        </w:tc>
+        <w:tc>
+          <w:tcPr>
+            <w:tcW w:type="dxa" w:w="1300"/>
+          </w:tcPr>
+          <w:p>
+            <w:pPr>
+              <w:spacing w:before="0" w:after="0" w:line="240" w:lineRule="auto"/>
+            </w:pPr>
+            <w:r>
+              <w:rPr>
+                <w:b/>
+                <w:sz w:val="16"/>
+              </w:rPr>
+              <w:t>1024</w:t>
+            </w:r>
+          </w:p>
+        </w:tc>
+        <w:tc>
+          <w:tcPr>
+            <w:tcW w:type="dxa" w:w="1448"/>
+          </w:tcPr>
+          <w:p>
+            <w:pPr>
+              <w:spacing w:before="0" w:after="0" w:line="240" w:lineRule="auto"/>
+            </w:pPr>
+            <w:r>
+              <w:rPr>
+                <w:b/>
+                <w:sz w:val="16"/>
+              </w:rPr>
+              <w:t>3584</w:t>
+            </w:r>
+          </w:p>
+        </w:tc>
+      </w:tr>
+    </w:tbl>
+    <w:p>
+      <w:pPr>
+        <w:pStyle w:val="Caption"/>
+      </w:pPr>
+      <w:r>
+        <w:rPr>
+          <w:b w:val="0"/>
+        </w:rPr>
+        <w:t>Table: Existing virtual machine estate – Production and DR</w:t>
+      </w:r>
+    </w:p>
+    <w:p>
+      <w:pPr/>
+      <w:r>
+        <w:rPr>
+          <w:b w:val="0"/>
+        </w:rPr>
+        <w:t>This project requires one additional application virtual machine, of the same specification as the existing application VM (VM‑1), to host SmartMES for Unit‑2 and Unit‑4.</w:t>
+      </w:r>
+    </w:p>
+    <w:tbl>
+      <w:tblPr>
+        <w:tblStyle w:val="SCILCorporateTable10"/>
+        <w:tblW w:w="10348" w:type="dxa"/>
+        <w:tblInd w:w="-709" w:type="dxa"/>
+        <w:tblBorders>
+          <w:top w:val="single" w:sz="4" w:space="0" w:color="auto"/>
+          <w:left w:val="single" w:sz="4" w:space="0" w:color="auto"/>
+          <w:bottom w:val="single" w:sz="4" w:space="0" w:color="auto"/>
+          <w:right w:val="single" w:sz="4" w:space="0" w:color="auto"/>
+          <w:insideH w:val="single" w:sz="4" w:space="0" w:color="auto"/>
+          <w:insideV w:val="single" w:sz="4" w:space="0" w:color="auto"/>
+        </w:tblBorders>
+        <w:tblLook w:val="04A0" w:firstRow="1" w:lastRow="0" w:firstColumn="1" w:lastColumn="0" w:noHBand="0" w:noVBand="1"/>
+      </w:tblPr>
+      <w:tblGrid>
+        <w:gridCol w:w="700"/>
+        <w:gridCol w:w="2100"/>
+        <w:gridCol w:w="900"/>
+        <w:gridCol w:w="1900"/>
+        <w:gridCol w:w="1100"/>
+        <w:gridCol w:w="900"/>
+        <w:gridCol w:w="1300"/>
+        <w:gridCol w:w="1448"/>
+      </w:tblGrid>
+      <w:tr>
+        <w:trPr>
+          <w:tblHeader/>
+        </w:trPr>
+        <w:tc>
+          <w:tcPr>
+            <w:tcW w:type="dxa" w:w="700"/>
+          </w:tcPr>
+          <w:p>
+            <w:pPr>
+              <w:spacing w:before="0" w:after="0" w:line="240" w:lineRule="auto"/>
+            </w:pPr>
+            <w:r>
+              <w:rPr>
+                <w:b w:val="0"/>
+                <w:sz w:val="16"/>
+              </w:rPr>
+              <w:t>VM</w:t>
+            </w:r>
+          </w:p>
+        </w:tc>
+        <w:tc>
+          <w:tcPr>
+            <w:tcW w:type="dxa" w:w="2100"/>
+          </w:tcPr>
+          <w:p>
+            <w:pPr>
+              <w:spacing w:before="0" w:after="0" w:line="240" w:lineRule="auto"/>
+            </w:pPr>
+            <w:r>
+              <w:rPr>
+                <w:b w:val="0"/>
+                <w:sz w:val="16"/>
+              </w:rPr>
+              <w:t>Purpose</w:t>
+            </w:r>
+          </w:p>
+        </w:tc>
+        <w:tc>
+          <w:tcPr>
+            <w:tcW w:type="dxa" w:w="900"/>
+          </w:tcPr>
+          <w:p>
+            <w:pPr>
+              <w:spacing w:before="0" w:after="0" w:line="240" w:lineRule="auto"/>
+            </w:pPr>
+            <w:r>
+              <w:rPr>
+                <w:b w:val="0"/>
+                <w:sz w:val="16"/>
+              </w:rPr>
+              <w:t>Server Type</w:t>
+            </w:r>
+          </w:p>
+        </w:tc>
+        <w:tc>
+          <w:tcPr>
+            <w:tcW w:type="dxa" w:w="1900"/>
+          </w:tcPr>
+          <w:p>
+            <w:pPr>
+              <w:spacing w:before="0" w:after="0" w:line="240" w:lineRule="auto"/>
+            </w:pPr>
+            <w:r>
+              <w:rPr>
+                <w:b w:val="0"/>
+                <w:sz w:val="16"/>
+              </w:rPr>
+              <w:t>OS</w:t>
+            </w:r>
+          </w:p>
+        </w:tc>
+        <w:tc>
+          <w:tcPr>
+            <w:tcW w:type="dxa" w:w="1100"/>
+          </w:tcPr>
+          <w:p>
+            <w:pPr>
+              <w:spacing w:before="0" w:after="0" w:line="240" w:lineRule="auto"/>
+            </w:pPr>
+            <w:r>
+              <w:rPr>
+                <w:b w:val="0"/>
+                <w:sz w:val="16"/>
+              </w:rPr>
+              <w:t>vCPU (2.4 GHz or above)</w:t>
+            </w:r>
+          </w:p>
+        </w:tc>
+        <w:tc>
+          <w:tcPr>
+            <w:tcW w:type="dxa" w:w="900"/>
+          </w:tcPr>
+          <w:p>
+            <w:pPr>
+              <w:spacing w:before="0" w:after="0" w:line="240" w:lineRule="auto"/>
+            </w:pPr>
+            <w:r>
+              <w:rPr>
+                <w:b w:val="0"/>
+                <w:sz w:val="16"/>
+              </w:rPr>
+              <w:t>RAM (GB)</w:t>
+            </w:r>
+          </w:p>
+        </w:tc>
+        <w:tc>
+          <w:tcPr>
+            <w:tcW w:type="dxa" w:w="1300"/>
+          </w:tcPr>
+          <w:p>
+            <w:pPr>
+              <w:spacing w:before="0" w:after="0" w:line="240" w:lineRule="auto"/>
+            </w:pPr>
+            <w:r>
+              <w:rPr>
+                <w:b w:val="0"/>
+                <w:sz w:val="16"/>
+              </w:rPr>
+              <w:t>C Drive (GB)</w:t>
+            </w:r>
+          </w:p>
+        </w:tc>
+        <w:tc>
+          <w:tcPr>
+            <w:tcW w:type="dxa" w:w="1448"/>
+          </w:tcPr>
+          <w:p>
+            <w:pPr>
+              <w:spacing w:before="0" w:after="0" w:line="240" w:lineRule="auto"/>
+            </w:pPr>
+            <w:r>
+              <w:rPr>
+                <w:b w:val="0"/>
+                <w:sz w:val="16"/>
+              </w:rPr>
+              <w:t>D Drive (GB)</w:t>
+            </w:r>
+          </w:p>
+        </w:tc>
+      </w:tr>
+      <w:tr>
+        <w:tc>
+          <w:tcPr>
+            <w:tcW w:type="dxa" w:w="700"/>
+          </w:tcPr>
+          <w:p>
+            <w:pPr>
+              <w:spacing w:before="0" w:after="0" w:line="240" w:lineRule="auto"/>
+            </w:pPr>
+            <w:r>
+              <w:rPr>
+                <w:b w:val="0"/>
+                <w:sz w:val="16"/>
+              </w:rPr>
+              <w:t>VM‑5</w:t>
+            </w:r>
+          </w:p>
+        </w:tc>
+        <w:tc>
+          <w:tcPr>
+            <w:tcW w:type="dxa" w:w="2100"/>
+          </w:tcPr>
+          <w:p>
+            <w:pPr>
+              <w:spacing w:before="0" w:after="0" w:line="240" w:lineRule="auto"/>
+            </w:pPr>
+            <w:r>
+              <w:rPr>
+                <w:b w:val="0"/>
+                <w:sz w:val="16"/>
+              </w:rPr>
+              <w:t>SmartMES Application (Unit‑2 &amp; Unit‑4)</w:t>
+            </w:r>
+          </w:p>
+        </w:tc>
+        <w:tc>
+          <w:tcPr>
+            <w:tcW w:type="dxa" w:w="900"/>
+          </w:tcPr>
+          <w:p>
+            <w:pPr>
+              <w:spacing w:before="0" w:after="0" w:line="240" w:lineRule="auto"/>
+            </w:pPr>
+            <w:r>
+              <w:rPr>
+                <w:b w:val="0"/>
+                <w:sz w:val="16"/>
+              </w:rPr>
+              <w:t>VM</w:t>
+            </w:r>
+          </w:p>
+        </w:tc>
+        <w:tc>
+          <w:tcPr>
+            <w:tcW w:type="dxa" w:w="1900"/>
+          </w:tcPr>
+          <w:p>
+            <w:pPr>
+              <w:spacing w:before="0" w:after="0" w:line="240" w:lineRule="auto"/>
+            </w:pPr>
+            <w:r>
+              <w:rPr>
+                <w:b w:val="0"/>
+                <w:sz w:val="16"/>
+              </w:rPr>
+              <w:t>Windows Server 2022</w:t>
+            </w:r>
+          </w:p>
+        </w:tc>
+        <w:tc>
+          <w:tcPr>
+            <w:tcW w:type="dxa" w:w="1100"/>
+          </w:tcPr>
+          <w:p>
+            <w:pPr>
+              <w:spacing w:before="0" w:after="0" w:line="240" w:lineRule="auto"/>
+            </w:pPr>
+            <w:r>
+              <w:rPr>
+                <w:b w:val="0"/>
+                <w:sz w:val="16"/>
+              </w:rPr>
+              <w:t>12</w:t>
+            </w:r>
+          </w:p>
+        </w:tc>
+        <w:tc>
+          <w:tcPr>
+            <w:tcW w:type="dxa" w:w="900"/>
+          </w:tcPr>
+          <w:p>
+            <w:pPr>
+              <w:spacing w:before="0" w:after="0" w:line="240" w:lineRule="auto"/>
+            </w:pPr>
+            <w:r>
+              <w:rPr>
+                <w:b w:val="0"/>
+                <w:sz w:val="16"/>
+              </w:rPr>
+              <w:t>64</w:t>
+            </w:r>
+          </w:p>
+        </w:tc>
+        <w:tc>
+          <w:tcPr>
+            <w:tcW w:type="dxa" w:w="1300"/>
+          </w:tcPr>
+          <w:p>
+            <w:pPr>
+              <w:spacing w:before="0" w:after="0" w:line="240" w:lineRule="auto"/>
+            </w:pPr>
+            <w:r>
+              <w:rPr>
+                <w:b w:val="0"/>
+                <w:sz w:val="16"/>
+              </w:rPr>
+              <w:t>256</w:t>
+            </w:r>
+          </w:p>
+        </w:tc>
+        <w:tc>
+          <w:tcPr>
+            <w:tcW w:type="dxa" w:w="1448"/>
+          </w:tcPr>
+          <w:p>
+            <w:pPr>
+              <w:spacing w:before="0" w:after="0" w:line="240" w:lineRule="auto"/>
+            </w:pPr>
+            <w:r>
+              <w:rPr>
+                <w:b w:val="0"/>
+                <w:sz w:val="16"/>
+              </w:rPr>
+              <w:t>512</w:t>
+            </w:r>
+          </w:p>
+        </w:tc>
+      </w:tr>
+    </w:tbl>
+    <w:p>
+      <w:pPr>
+        <w:pStyle w:val="Caption"/>
+      </w:pPr>
+      <w:r>
+        <w:rPr>
+          <w:b w:val="0"/>
+        </w:rPr>
+        <w:t>Table: Additional virtual machine required for this project</w:t>
+      </w:r>
+    </w:p>
+    <w:p>
+      <w:pPr/>
+      <w:r>
+        <w:rPr>
+          <w:b/>
+        </w:rPr>
+        <w:t>Notes:</w:t>
+      </w:r>
+    </w:p>
+    <w:p>
+      <w:pPr>
+        <w:pStyle w:val="ListParagraph"/>
+        <w:numPr>
+          <w:ilvl w:val="0"/>
+          <w:numId w:val="46"/>
+        </w:numPr>
+      </w:pPr>
+      <w:r>
+        <w:rPr>
+          <w:b w:val="0"/>
+        </w:rPr>
+        <w:t>The additional virtual machine is to be provided by the customer, in line with the infrastructure responsibilities set out in the Roles and Responsibilities section of this document.</w:t>
+      </w:r>
+    </w:p>
+    <w:p>
+      <w:pPr>
+        <w:pStyle w:val="ListParagraph"/>
+        <w:numPr>
+          <w:ilvl w:val="0"/>
+          <w:numId w:val="46"/>
+        </w:numPr>
+      </w:pPr>
+      <w:r>
+        <w:rPr>
+          <w:b w:val="0"/>
+        </w:rPr>
+        <w:t>Whether a matching application virtual machine is also required in the DR environment is to be confirmed. The figures above cover the Production environment only.</w:t>
+      </w:r>
+    </w:p>
+    <w:p>
+      <w:pPr>
+        <w:pStyle w:val="ListParagraph"/>
+        <w:numPr>
+          <w:ilvl w:val="0"/>
+          <w:numId w:val="46"/>
+        </w:numPr>
+      </w:pPr>
+      <w:r>
+        <w:rPr>
+          <w:b w:val="0"/>
+        </w:rPr>
+        <w:t>The existing Testing VM (UAT) and DB VM are assumed to be shared with this project rather than duplicated. Database sizing for SmartMES is to be reassessed against the existing DB VM after Functional Design sign off.</w:t>
+      </w:r>
+    </w:p>
+    <w:p>
+      <w:pPr>
+        <w:pStyle w:val="ListParagraph"/>
+        <w:numPr>
+          <w:ilvl w:val="0"/>
+          <w:numId w:val="46"/>
+        </w:numPr>
+      </w:pPr>
+      <w:r>
+        <w:rPr>
+          <w:b w:val="0"/>
+        </w:rPr>
+        <w:t>Server sizing shall be reviewed once the machine count, tag count and data retention period are frozen during the Requirement Freeze and Functional Design phases.</w:t>
       </w:r>
     </w:p>
     <w:p/>
@@ -41015,6 +43054,12 @@
       <w:startOverride w:val="1"/>
     </w:lvlOverride>
   </w:num>
+  <w:num w:numId="46">
+    <w:abstractNumId w:val="6"/>
+    <w:lvlOverride w:ilvl="0">
+      <w:startOverride w:val="1"/>
+    </w:lvlOverride>
+  </w:num>
   <w:numIdMacAtCleanup w:val="12"/>
 </w:numbering>
 </file>

</xml_diff>

<commit_message>
Mirror the additional application VM into DR
DR mirrors Production, so the additional VM is required in both
environments rather than Production alone. The additional requirement table
now carries Production and DR bands and totals 24 vCPU, 128 GB RAM, 512 GB
of C drive and 1024 GB of D drive.

The note that left the DR counterpart open is replaced with the resulting
figures: 60 vCPU, 432 GB RAM, 1280 GB C and 4096 GB D per environment, and
120 vCPU, 864 GB RAM, 2560 GB C and 8192 GB D across both.

Co-Authored-By: Claude Opus 5 <noreply@anthropic.com>
Claude-Session: https://claude.ai/code/session_01YStD3bG3sa5RhFH78QQvxt
</commit_message>
<xml_diff>
--- a/JK_Lakshar_MES_XXXXX_Technical Offer_R0.docx
+++ b/JK_Lakshar_MES_XXXXX_Technical Offer_R0.docx
@@ -27454,7 +27454,7 @@
         <w:rPr>
           <w:b w:val="0"/>
         </w:rPr>
-        <w:t>This project requires one additional application virtual machine, of the same specification as the existing application VM (VM‑1), to host SmartMES for Unit‑2 and Unit‑4.</w:t>
+        <w:t>This project requires one additional application virtual machine, of the same specification as the existing application VM (VM‑1), to host SmartMES for Unit‑2 and Unit‑4. The DR environment mirrors Production, so the same virtual machine is required in each.</w:t>
       </w:r>
     </w:p>
     <w:tbl>
@@ -27626,6 +27626,27 @@
       <w:tr>
         <w:tc>
           <w:tcPr>
+            <w:tcW w:type="dxa" w:w="10348"/>
+            <w:gridSpan w:val="8"/>
+          </w:tcPr>
+          <w:p>
+            <w:pPr>
+              <w:spacing w:before="0" w:after="0" w:line="240" w:lineRule="auto"/>
+              <w:jc w:val="center"/>
+            </w:pPr>
+            <w:r>
+              <w:rPr>
+                <w:b/>
+                <w:sz w:val="16"/>
+              </w:rPr>
+              <w:t>Production</w:t>
+            </w:r>
+          </w:p>
+        </w:tc>
+      </w:tr>
+      <w:tr>
+        <w:tc>
+          <w:tcPr>
             <w:tcW w:type="dxa" w:w="700"/>
           </w:tcPr>
           <w:p>
@@ -27757,6 +27778,300 @@
                 <w:sz w:val="16"/>
               </w:rPr>
               <w:t>512</w:t>
+            </w:r>
+          </w:p>
+        </w:tc>
+      </w:tr>
+      <w:tr>
+        <w:tc>
+          <w:tcPr>
+            <w:tcW w:type="dxa" w:w="10348"/>
+            <w:gridSpan w:val="8"/>
+          </w:tcPr>
+          <w:p>
+            <w:pPr>
+              <w:spacing w:before="0" w:after="0" w:line="240" w:lineRule="auto"/>
+              <w:jc w:val="center"/>
+            </w:pPr>
+            <w:r>
+              <w:rPr>
+                <w:b/>
+                <w:sz w:val="16"/>
+              </w:rPr>
+              <w:t>DR</w:t>
+            </w:r>
+          </w:p>
+        </w:tc>
+      </w:tr>
+      <w:tr>
+        <w:tc>
+          <w:tcPr>
+            <w:tcW w:type="dxa" w:w="700"/>
+          </w:tcPr>
+          <w:p>
+            <w:pPr>
+              <w:spacing w:before="0" w:after="0" w:line="240" w:lineRule="auto"/>
+            </w:pPr>
+            <w:r>
+              <w:rPr>
+                <w:b w:val="0"/>
+                <w:sz w:val="16"/>
+              </w:rPr>
+              <w:t>VM‑5</w:t>
+            </w:r>
+          </w:p>
+        </w:tc>
+        <w:tc>
+          <w:tcPr>
+            <w:tcW w:type="dxa" w:w="2100"/>
+          </w:tcPr>
+          <w:p>
+            <w:pPr>
+              <w:spacing w:before="0" w:after="0" w:line="240" w:lineRule="auto"/>
+            </w:pPr>
+            <w:r>
+              <w:rPr>
+                <w:b w:val="0"/>
+                <w:sz w:val="16"/>
+              </w:rPr>
+              <w:t>SmartMES Application (Unit‑2 &amp; Unit‑4)</w:t>
+            </w:r>
+          </w:p>
+        </w:tc>
+        <w:tc>
+          <w:tcPr>
+            <w:tcW w:type="dxa" w:w="900"/>
+          </w:tcPr>
+          <w:p>
+            <w:pPr>
+              <w:spacing w:before="0" w:after="0" w:line="240" w:lineRule="auto"/>
+            </w:pPr>
+            <w:r>
+              <w:rPr>
+                <w:b w:val="0"/>
+                <w:sz w:val="16"/>
+              </w:rPr>
+              <w:t>VM</w:t>
+            </w:r>
+          </w:p>
+        </w:tc>
+        <w:tc>
+          <w:tcPr>
+            <w:tcW w:type="dxa" w:w="1900"/>
+          </w:tcPr>
+          <w:p>
+            <w:pPr>
+              <w:spacing w:before="0" w:after="0" w:line="240" w:lineRule="auto"/>
+            </w:pPr>
+            <w:r>
+              <w:rPr>
+                <w:b w:val="0"/>
+                <w:sz w:val="16"/>
+              </w:rPr>
+              <w:t>Windows Server 2022</w:t>
+            </w:r>
+          </w:p>
+        </w:tc>
+        <w:tc>
+          <w:tcPr>
+            <w:tcW w:type="dxa" w:w="1100"/>
+          </w:tcPr>
+          <w:p>
+            <w:pPr>
+              <w:spacing w:before="0" w:after="0" w:line="240" w:lineRule="auto"/>
+            </w:pPr>
+            <w:r>
+              <w:rPr>
+                <w:b w:val="0"/>
+                <w:sz w:val="16"/>
+              </w:rPr>
+              <w:t>12</w:t>
+            </w:r>
+          </w:p>
+        </w:tc>
+        <w:tc>
+          <w:tcPr>
+            <w:tcW w:type="dxa" w:w="900"/>
+          </w:tcPr>
+          <w:p>
+            <w:pPr>
+              <w:spacing w:before="0" w:after="0" w:line="240" w:lineRule="auto"/>
+            </w:pPr>
+            <w:r>
+              <w:rPr>
+                <w:b w:val="0"/>
+                <w:sz w:val="16"/>
+              </w:rPr>
+              <w:t>64</w:t>
+            </w:r>
+          </w:p>
+        </w:tc>
+        <w:tc>
+          <w:tcPr>
+            <w:tcW w:type="dxa" w:w="1300"/>
+          </w:tcPr>
+          <w:p>
+            <w:pPr>
+              <w:spacing w:before="0" w:after="0" w:line="240" w:lineRule="auto"/>
+            </w:pPr>
+            <w:r>
+              <w:rPr>
+                <w:b w:val="0"/>
+                <w:sz w:val="16"/>
+              </w:rPr>
+              <w:t>256</w:t>
+            </w:r>
+          </w:p>
+        </w:tc>
+        <w:tc>
+          <w:tcPr>
+            <w:tcW w:type="dxa" w:w="1448"/>
+          </w:tcPr>
+          <w:p>
+            <w:pPr>
+              <w:spacing w:before="0" w:after="0" w:line="240" w:lineRule="auto"/>
+            </w:pPr>
+            <w:r>
+              <w:rPr>
+                <w:b w:val="0"/>
+                <w:sz w:val="16"/>
+              </w:rPr>
+              <w:t>512</w:t>
+            </w:r>
+          </w:p>
+        </w:tc>
+      </w:tr>
+      <w:tr>
+        <w:tc>
+          <w:tcPr>
+            <w:tcW w:type="dxa" w:w="700"/>
+          </w:tcPr>
+          <w:p>
+            <w:pPr>
+              <w:spacing w:before="0" w:after="0" w:line="240" w:lineRule="auto"/>
+            </w:pPr>
+            <w:r>
+              <w:rPr>
+                <w:b/>
+                <w:sz w:val="16"/>
+              </w:rPr>
+            </w:r>
+          </w:p>
+        </w:tc>
+        <w:tc>
+          <w:tcPr>
+            <w:tcW w:type="dxa" w:w="2100"/>
+          </w:tcPr>
+          <w:p>
+            <w:pPr>
+              <w:spacing w:before="0" w:after="0" w:line="240" w:lineRule="auto"/>
+            </w:pPr>
+            <w:r>
+              <w:rPr>
+                <w:b/>
+                <w:sz w:val="16"/>
+              </w:rPr>
+              <w:t>Overall Additional Resources</w:t>
+            </w:r>
+          </w:p>
+        </w:tc>
+        <w:tc>
+          <w:tcPr>
+            <w:tcW w:type="dxa" w:w="900"/>
+          </w:tcPr>
+          <w:p>
+            <w:pPr>
+              <w:spacing w:before="0" w:after="0" w:line="240" w:lineRule="auto"/>
+            </w:pPr>
+            <w:r>
+              <w:rPr>
+                <w:b/>
+                <w:sz w:val="16"/>
+              </w:rPr>
+            </w:r>
+          </w:p>
+        </w:tc>
+        <w:tc>
+          <w:tcPr>
+            <w:tcW w:type="dxa" w:w="1900"/>
+          </w:tcPr>
+          <w:p>
+            <w:pPr>
+              <w:spacing w:before="0" w:after="0" w:line="240" w:lineRule="auto"/>
+            </w:pPr>
+            <w:r>
+              <w:rPr>
+                <w:b/>
+                <w:sz w:val="16"/>
+              </w:rPr>
+            </w:r>
+          </w:p>
+        </w:tc>
+        <w:tc>
+          <w:tcPr>
+            <w:tcW w:type="dxa" w:w="1100"/>
+          </w:tcPr>
+          <w:p>
+            <w:pPr>
+              <w:spacing w:before="0" w:after="0" w:line="240" w:lineRule="auto"/>
+            </w:pPr>
+            <w:r>
+              <w:rPr>
+                <w:b/>
+                <w:sz w:val="16"/>
+              </w:rPr>
+              <w:t>24</w:t>
+            </w:r>
+          </w:p>
+        </w:tc>
+        <w:tc>
+          <w:tcPr>
+            <w:tcW w:type="dxa" w:w="900"/>
+          </w:tcPr>
+          <w:p>
+            <w:pPr>
+              <w:spacing w:before="0" w:after="0" w:line="240" w:lineRule="auto"/>
+            </w:pPr>
+            <w:r>
+              <w:rPr>
+                <w:b/>
+                <w:sz w:val="16"/>
+              </w:rPr>
+              <w:t>128</w:t>
+            </w:r>
+          </w:p>
+        </w:tc>
+        <w:tc>
+          <w:tcPr>
+            <w:tcW w:type="dxa" w:w="1300"/>
+          </w:tcPr>
+          <w:p>
+            <w:pPr>
+              <w:spacing w:before="0" w:after="0" w:line="240" w:lineRule="auto"/>
+            </w:pPr>
+            <w:r>
+              <w:rPr>
+                <w:b/>
+                <w:sz w:val="16"/>
+              </w:rPr>
+              <w:t>512</w:t>
+            </w:r>
+          </w:p>
+        </w:tc>
+        <w:tc>
+          <w:tcPr>
+            <w:tcW w:type="dxa" w:w="1448"/>
+          </w:tcPr>
+          <w:p>
+            <w:pPr>
+              <w:spacing w:before="0" w:after="0" w:line="240" w:lineRule="auto"/>
+            </w:pPr>
+            <w:r>
+              <w:rPr>
+                <w:b/>
+                <w:sz w:val="16"/>
+              </w:rPr>
+              <w:t>1024</w:t>
             </w:r>
           </w:p>
         </w:tc>
@@ -27770,7 +28085,7 @@
         <w:rPr>
           <w:b w:val="0"/>
         </w:rPr>
-        <w:t>Table: Additional virtual machine required for this project</w:t>
+        <w:t>Table: Additional virtual machines required for this project</w:t>
       </w:r>
     </w:p>
     <w:p>
@@ -27809,7 +28124,7 @@
         <w:rPr>
           <w:b w:val="0"/>
         </w:rPr>
-        <w:t>Whether a matching application virtual machine is also required in the DR environment is to be confirmed. The figures above cover the Production environment only.</w:t>
+        <w:t>With the additional virtual machine in place, the resource required in each environment becomes 60 vCPU, 432 GB RAM, 1280 GB of C drive and 4096 GB of D drive, and 120 vCPU, 864 GB RAM, 2560 GB of C drive and 8192 GB of D drive across Production and DR together.</w:t>
       </w:r>
     </w:p>
     <w:p>

</xml_diff>

<commit_message>
Place Kepware OPC Server on the application VM
Kepware runs on the same application VM as SmartMES, so no separate VM is
required for it. VM-5 is renamed accordingly and the section 4.2 notes
record the co-residency, with sizing to be reviewed against the final tag
count during Functional Design, since the machine now carries both SmartMES
and the OPC server polling the interfaced machines.

The section 4.1 lead-in states that the Kepware and SmartMES layers shown
separately in the diagrams share one virtual machine, so the block diagram
is not read as two servers.

Co-Authored-By: Claude Opus 5 <noreply@anthropic.com>
Claude-Session: https://claude.ai/code/session_01YStD3bG3sa5RhFH78QQvxt
</commit_message>
<xml_diff>
--- a/JK_Lakshar_MES_XXXXX_Technical Offer_R0.docx
+++ b/JK_Lakshar_MES_XXXXX_Technical Offer_R0.docx
@@ -25016,7 +25016,7 @@
     <w:p>
       <w:pPr/>
       <w:r>
-        <w:t>Machine data is acquired by Kepware OPC Server over an isolated industrial OT network and passed to the SmartMES server over OPC UA. Controllers with a built‑in Ethernet port connect directly through an industrial NAT device, which provides isolation and avoids IP conflicts with the existing machine networks. Legacy controllers are brought onto the same network through an OEM Ethernet communication module, as detailed in the Machine Details section.</w:t>
+        <w:t>Machine data is acquired by Kepware OPC Server over an isolated industrial OT network and passed to the SmartMES server over OPC UA. Controllers with a built‑in Ethernet port connect directly through an industrial NAT device, which provides isolation and avoids IP conflicts with the existing machine networks. Legacy controllers are brought onto the same network through an OEM Ethernet communication module, as detailed in the Machine Details section. The Kepware and SmartMES layers are shown separately below; both run on the same application virtual machine, as set out in the IT Architecture section.</w:t>
       </w:r>
     </w:p>
     <w:tbl>
@@ -27454,7 +27454,7 @@
         <w:rPr>
           <w:b w:val="0"/>
         </w:rPr>
-        <w:t>This project requires one additional application virtual machine, of the same specification as the existing application VM (VM‑1), to host SmartMES for Unit‑2 and Unit‑4. The DR environment mirrors Production, so the same virtual machine is required in each.</w:t>
+        <w:t>This project requires one additional application virtual machine, of the same specification as the existing application VM (VM‑1), to host SmartMES and the Kepware OPC Server for Unit‑2 and Unit‑4. The DR environment mirrors Production, so the same virtual machine is required in each.</w:t>
       </w:r>
     </w:p>
     <w:tbl>
@@ -27675,7 +27675,7 @@
                 <w:b w:val="0"/>
                 <w:sz w:val="16"/>
               </w:rPr>
-              <w:t>SmartMES Application (Unit‑2 &amp; Unit‑4)</w:t>
+              <w:t>SmartMES Application &amp; Kepware OPC Server</w:t>
             </w:r>
           </w:p>
         </w:tc>
@@ -27834,7 +27834,7 @@
                 <w:b w:val="0"/>
                 <w:sz w:val="16"/>
               </w:rPr>
-              <w:t>SmartMES Application (Unit‑2 &amp; Unit‑4)</w:t>
+              <w:t>SmartMES Application &amp; Kepware OPC Server</w:t>
             </w:r>
           </w:p>
         </w:tc>
@@ -28110,6 +28110,21 @@
           <w:b w:val="0"/>
         </w:rPr>
         <w:t>The additional virtual machine is to be provided by the customer, in line with the infrastructure responsibilities set out in the Roles and Responsibilities section of this document.</w:t>
+      </w:r>
+    </w:p>
+    <w:p>
+      <w:pPr>
+        <w:pStyle w:val="ListParagraph"/>
+        <w:numPr>
+          <w:ilvl w:val="0"/>
+          <w:numId w:val="46"/>
+        </w:numPr>
+      </w:pPr>
+      <w:r>
+        <w:rPr>
+          <w:b w:val="0"/>
+        </w:rPr>
+        <w:t>The Kepware OPC Server runs on this same application virtual machine; no separate virtual machine is required for it. As the machine carries both SmartMES and the OPC server polling the interfaced machines, its sizing is to be reviewed against the final tag count during Functional Design.</w:t>
       </w:r>
     </w:p>
     <w:p>

</xml_diff>

<commit_message>
Add the project timeline, rescaled to 9 months
The reference plan runs to roughly 74 weeks. Section 7.4 now carries the
same phase structure, sequence and overlaps compressed to 39 weeks, shown
as a Gantt against month bands M1 to M9 with the start week and duration of
each activity.

Service stream: requirement workshop weeks 1-3, FDS 4-8 with ICD 5-8,
development 9-20, SIT 19-23, UAT 24-28, go live 29-31, hyper care 32-37,
handover 38-39.

Supply stream runs in parallel: procurement weeks 2-3, delivery 4-9,
readiness 10-13, and installation and commissioning 14-21, so machine data
is available before UAT starts in week 24.

The basis note records what the schedule depends on: the sign off gates at
weeks 3, 8 and 28, standard lead times on the interfacing hardware, and
availability of the new and refurbished machines before the commissioning
window closes.

Co-Authored-By: Claude Opus 5 <noreply@anthropic.com>
Claude-Session: https://claude.ai/code/session_01YStD3bG3sa5RhFH78QQvxt
</commit_message>
<xml_diff>
--- a/JK_Lakshar_MES_XXXXX_Technical Offer_R0.docx
+++ b/JK_Lakshar_MES_XXXXX_Technical Offer_R0.docx
@@ -39245,6 +39245,2746 @@
       </w:r>
       <w:bookmarkEnd w:id="65"/>
       <w:bookmarkEnd w:id="66"/>
+    </w:p>
+    <w:p>
+      <w:pPr/>
+      <w:r>
+        <w:rPr>
+          <w:b w:val="0"/>
+        </w:rPr>
+        <w:t>The project is planned over 39 weeks, that is 9 months from kick‑off. The schedule below shows the service and supply streams against month bands M1 to M9, with the start week and duration of each activity.</w:t>
+      </w:r>
+    </w:p>
+    <w:tbl>
+      <w:tblPr>
+        <w:tblStyle w:val="SCILCorporateTable10"/>
+        <w:tblW w:w="10348" w:type="dxa"/>
+        <w:tblInd w:w="-709" w:type="dxa"/>
+        <w:tblBorders>
+          <w:top w:val="single" w:sz="4" w:space="0" w:color="auto"/>
+          <w:left w:val="single" w:sz="4" w:space="0" w:color="auto"/>
+          <w:bottom w:val="single" w:sz="4" w:space="0" w:color="auto"/>
+          <w:right w:val="single" w:sz="4" w:space="0" w:color="auto"/>
+          <w:insideH w:val="single" w:sz="4" w:space="0" w:color="auto"/>
+          <w:insideV w:val="single" w:sz="4" w:space="0" w:color="auto"/>
+        </w:tblBorders>
+        <w:tblLook w:val="04A0" w:firstRow="1" w:lastRow="0" w:firstColumn="1" w:lastColumn="0" w:noHBand="0" w:noVBand="1"/>
+      </w:tblPr>
+      <w:tblGrid>
+        <w:gridCol w:w="550"/>
+        <w:gridCol w:w="900"/>
+        <w:gridCol w:w="2250"/>
+        <w:gridCol w:w="600"/>
+        <w:gridCol w:w="600"/>
+        <w:gridCol w:w="605"/>
+        <w:gridCol w:w="605"/>
+        <w:gridCol w:w="605"/>
+        <w:gridCol w:w="605"/>
+        <w:gridCol w:w="605"/>
+        <w:gridCol w:w="605"/>
+        <w:gridCol w:w="605"/>
+        <w:gridCol w:w="605"/>
+        <w:gridCol w:w="608"/>
+      </w:tblGrid>
+      <w:tr>
+        <w:trPr>
+          <w:tblHeader/>
+        </w:trPr>
+        <w:tc>
+          <w:tcPr>
+            <w:tcW w:w="550" w:type="dxa"/>
+          </w:tcPr>
+          <w:p>
+            <w:pPr>
+              <w:spacing w:before="0" w:after="0" w:line="240" w:lineRule="auto"/>
+            </w:pPr>
+            <w:r>
+              <w:rPr>
+                <w:sz w:val="16"/>
+              </w:rPr>
+              <w:t>S.No</w:t>
+            </w:r>
+          </w:p>
+        </w:tc>
+        <w:tc>
+          <w:tcPr>
+            <w:tcW w:w="900" w:type="dxa"/>
+          </w:tcPr>
+          <w:p>
+            <w:pPr>
+              <w:spacing w:before="0" w:after="0" w:line="240" w:lineRule="auto"/>
+            </w:pPr>
+            <w:r>
+              <w:rPr>
+                <w:sz w:val="16"/>
+              </w:rPr>
+              <w:t>Scope</w:t>
+            </w:r>
+          </w:p>
+        </w:tc>
+        <w:tc>
+          <w:tcPr>
+            <w:tcW w:w="2250" w:type="dxa"/>
+          </w:tcPr>
+          <w:p>
+            <w:pPr>
+              <w:spacing w:before="0" w:after="0" w:line="240" w:lineRule="auto"/>
+            </w:pPr>
+            <w:r>
+              <w:rPr>
+                <w:sz w:val="16"/>
+              </w:rPr>
+              <w:t>Activity</w:t>
+            </w:r>
+          </w:p>
+        </w:tc>
+        <w:tc>
+          <w:tcPr>
+            <w:tcW w:w="600" w:type="dxa"/>
+          </w:tcPr>
+          <w:p>
+            <w:pPr>
+              <w:spacing w:before="0" w:after="0" w:line="240" w:lineRule="auto"/>
+            </w:pPr>
+            <w:r>
+              <w:rPr>
+                <w:sz w:val="16"/>
+              </w:rPr>
+              <w:t>Start Wk</w:t>
+            </w:r>
+          </w:p>
+        </w:tc>
+        <w:tc>
+          <w:tcPr>
+            <w:tcW w:w="600" w:type="dxa"/>
+          </w:tcPr>
+          <w:p>
+            <w:pPr>
+              <w:spacing w:before="0" w:after="0" w:line="240" w:lineRule="auto"/>
+            </w:pPr>
+            <w:r>
+              <w:rPr>
+                <w:sz w:val="16"/>
+              </w:rPr>
+              <w:t>Dur. Wk</w:t>
+            </w:r>
+          </w:p>
+        </w:tc>
+        <w:tc>
+          <w:tcPr>
+            <w:tcW w:w="605" w:type="dxa"/>
+          </w:tcPr>
+          <w:p>
+            <w:pPr>
+              <w:spacing w:before="0" w:after="0" w:line="240" w:lineRule="auto"/>
+              <w:jc w:val="center"/>
+            </w:pPr>
+            <w:r>
+              <w:rPr>
+                <w:sz w:val="16"/>
+              </w:rPr>
+              <w:t>M1</w:t>
+            </w:r>
+          </w:p>
+        </w:tc>
+        <w:tc>
+          <w:tcPr>
+            <w:tcW w:w="605" w:type="dxa"/>
+          </w:tcPr>
+          <w:p>
+            <w:pPr>
+              <w:spacing w:before="0" w:after="0" w:line="240" w:lineRule="auto"/>
+              <w:jc w:val="center"/>
+            </w:pPr>
+            <w:r>
+              <w:rPr>
+                <w:sz w:val="16"/>
+              </w:rPr>
+              <w:t>M2</w:t>
+            </w:r>
+          </w:p>
+        </w:tc>
+        <w:tc>
+          <w:tcPr>
+            <w:tcW w:w="605" w:type="dxa"/>
+          </w:tcPr>
+          <w:p>
+            <w:pPr>
+              <w:spacing w:before="0" w:after="0" w:line="240" w:lineRule="auto"/>
+              <w:jc w:val="center"/>
+            </w:pPr>
+            <w:r>
+              <w:rPr>
+                <w:sz w:val="16"/>
+              </w:rPr>
+              <w:t>M3</w:t>
+            </w:r>
+          </w:p>
+        </w:tc>
+        <w:tc>
+          <w:tcPr>
+            <w:tcW w:w="605" w:type="dxa"/>
+          </w:tcPr>
+          <w:p>
+            <w:pPr>
+              <w:spacing w:before="0" w:after="0" w:line="240" w:lineRule="auto"/>
+              <w:jc w:val="center"/>
+            </w:pPr>
+            <w:r>
+              <w:rPr>
+                <w:sz w:val="16"/>
+              </w:rPr>
+              <w:t>M4</w:t>
+            </w:r>
+          </w:p>
+        </w:tc>
+        <w:tc>
+          <w:tcPr>
+            <w:tcW w:w="605" w:type="dxa"/>
+          </w:tcPr>
+          <w:p>
+            <w:pPr>
+              <w:spacing w:before="0" w:after="0" w:line="240" w:lineRule="auto"/>
+              <w:jc w:val="center"/>
+            </w:pPr>
+            <w:r>
+              <w:rPr>
+                <w:sz w:val="16"/>
+              </w:rPr>
+              <w:t>M5</w:t>
+            </w:r>
+          </w:p>
+        </w:tc>
+        <w:tc>
+          <w:tcPr>
+            <w:tcW w:w="605" w:type="dxa"/>
+          </w:tcPr>
+          <w:p>
+            <w:pPr>
+              <w:spacing w:before="0" w:after="0" w:line="240" w:lineRule="auto"/>
+              <w:jc w:val="center"/>
+            </w:pPr>
+            <w:r>
+              <w:rPr>
+                <w:sz w:val="16"/>
+              </w:rPr>
+              <w:t>M6</w:t>
+            </w:r>
+          </w:p>
+        </w:tc>
+        <w:tc>
+          <w:tcPr>
+            <w:tcW w:w="605" w:type="dxa"/>
+          </w:tcPr>
+          <w:p>
+            <w:pPr>
+              <w:spacing w:before="0" w:after="0" w:line="240" w:lineRule="auto"/>
+              <w:jc w:val="center"/>
+            </w:pPr>
+            <w:r>
+              <w:rPr>
+                <w:sz w:val="16"/>
+              </w:rPr>
+              <w:t>M7</w:t>
+            </w:r>
+          </w:p>
+        </w:tc>
+        <w:tc>
+          <w:tcPr>
+            <w:tcW w:w="605" w:type="dxa"/>
+          </w:tcPr>
+          <w:p>
+            <w:pPr>
+              <w:spacing w:before="0" w:after="0" w:line="240" w:lineRule="auto"/>
+              <w:jc w:val="center"/>
+            </w:pPr>
+            <w:r>
+              <w:rPr>
+                <w:sz w:val="16"/>
+              </w:rPr>
+              <w:t>M8</w:t>
+            </w:r>
+          </w:p>
+        </w:tc>
+        <w:tc>
+          <w:tcPr>
+            <w:tcW w:w="608" w:type="dxa"/>
+          </w:tcPr>
+          <w:p>
+            <w:pPr>
+              <w:spacing w:before="0" w:after="0" w:line="240" w:lineRule="auto"/>
+              <w:jc w:val="center"/>
+            </w:pPr>
+            <w:r>
+              <w:rPr>
+                <w:sz w:val="16"/>
+              </w:rPr>
+              <w:t>M9</w:t>
+            </w:r>
+          </w:p>
+        </w:tc>
+      </w:tr>
+      <w:tr>
+        <w:tc>
+          <w:tcPr>
+            <w:tcW w:w="550" w:type="dxa"/>
+          </w:tcPr>
+          <w:p>
+            <w:pPr>
+              <w:spacing w:before="0" w:after="0" w:line="240" w:lineRule="auto"/>
+            </w:pPr>
+            <w:r>
+              <w:rPr>
+                <w:sz w:val="16"/>
+              </w:rPr>
+              <w:t>1</w:t>
+            </w:r>
+          </w:p>
+        </w:tc>
+        <w:tc>
+          <w:tcPr>
+            <w:tcW w:w="900" w:type="dxa"/>
+            <w:vMerge w:val="restart"/>
+          </w:tcPr>
+          <w:p>
+            <w:pPr>
+              <w:spacing w:before="0" w:after="0" w:line="240" w:lineRule="auto"/>
+            </w:pPr>
+            <w:r>
+              <w:rPr>
+                <w:b/>
+                <w:sz w:val="16"/>
+              </w:rPr>
+              <w:t>Service</w:t>
+            </w:r>
+          </w:p>
+        </w:tc>
+        <w:tc>
+          <w:tcPr>
+            <w:tcW w:w="2250" w:type="dxa"/>
+          </w:tcPr>
+          <w:p>
+            <w:pPr>
+              <w:spacing w:before="0" w:after="0" w:line="240" w:lineRule="auto"/>
+            </w:pPr>
+            <w:r>
+              <w:rPr>
+                <w:sz w:val="16"/>
+              </w:rPr>
+              <w:t>Requirement Workshop and Business Requirement Document (BRD)</w:t>
+            </w:r>
+          </w:p>
+        </w:tc>
+        <w:tc>
+          <w:tcPr>
+            <w:tcW w:w="600" w:type="dxa"/>
+          </w:tcPr>
+          <w:p>
+            <w:pPr>
+              <w:spacing w:before="0" w:after="0" w:line="240" w:lineRule="auto"/>
+              <w:jc w:val="center"/>
+            </w:pPr>
+            <w:r>
+              <w:rPr>
+                <w:sz w:val="16"/>
+              </w:rPr>
+              <w:t>1</w:t>
+            </w:r>
+          </w:p>
+        </w:tc>
+        <w:tc>
+          <w:tcPr>
+            <w:tcW w:w="600" w:type="dxa"/>
+          </w:tcPr>
+          <w:p>
+            <w:pPr>
+              <w:spacing w:before="0" w:after="0" w:line="240" w:lineRule="auto"/>
+              <w:jc w:val="center"/>
+            </w:pPr>
+            <w:r>
+              <w:rPr>
+                <w:sz w:val="16"/>
+              </w:rPr>
+              <w:t>3</w:t>
+            </w:r>
+          </w:p>
+        </w:tc>
+        <w:tc>
+          <w:tcPr>
+            <w:tcW w:w="605" w:type="dxa"/>
+            <w:shd w:val="clear" w:color="auto" w:fill="27166F"/>
+          </w:tcPr>
+          <w:p>
+            <w:pPr>
+              <w:spacing w:before="0" w:after="0" w:line="240" w:lineRule="auto"/>
+              <w:jc w:val="center"/>
+            </w:pPr>
+          </w:p>
+        </w:tc>
+        <w:tc>
+          <w:tcPr>
+            <w:tcW w:w="605" w:type="dxa"/>
+          </w:tcPr>
+          <w:p>
+            <w:pPr>
+              <w:spacing w:before="0" w:after="0" w:line="240" w:lineRule="auto"/>
+              <w:jc w:val="center"/>
+            </w:pPr>
+          </w:p>
+        </w:tc>
+        <w:tc>
+          <w:tcPr>
+            <w:tcW w:w="605" w:type="dxa"/>
+          </w:tcPr>
+          <w:p>
+            <w:pPr>
+              <w:spacing w:before="0" w:after="0" w:line="240" w:lineRule="auto"/>
+              <w:jc w:val="center"/>
+            </w:pPr>
+          </w:p>
+        </w:tc>
+        <w:tc>
+          <w:tcPr>
+            <w:tcW w:w="605" w:type="dxa"/>
+          </w:tcPr>
+          <w:p>
+            <w:pPr>
+              <w:spacing w:before="0" w:after="0" w:line="240" w:lineRule="auto"/>
+              <w:jc w:val="center"/>
+            </w:pPr>
+          </w:p>
+        </w:tc>
+        <w:tc>
+          <w:tcPr>
+            <w:tcW w:w="605" w:type="dxa"/>
+          </w:tcPr>
+          <w:p>
+            <w:pPr>
+              <w:spacing w:before="0" w:after="0" w:line="240" w:lineRule="auto"/>
+              <w:jc w:val="center"/>
+            </w:pPr>
+          </w:p>
+        </w:tc>
+        <w:tc>
+          <w:tcPr>
+            <w:tcW w:w="605" w:type="dxa"/>
+          </w:tcPr>
+          <w:p>
+            <w:pPr>
+              <w:spacing w:before="0" w:after="0" w:line="240" w:lineRule="auto"/>
+              <w:jc w:val="center"/>
+            </w:pPr>
+          </w:p>
+        </w:tc>
+        <w:tc>
+          <w:tcPr>
+            <w:tcW w:w="605" w:type="dxa"/>
+          </w:tcPr>
+          <w:p>
+            <w:pPr>
+              <w:spacing w:before="0" w:after="0" w:line="240" w:lineRule="auto"/>
+              <w:jc w:val="center"/>
+            </w:pPr>
+          </w:p>
+        </w:tc>
+        <w:tc>
+          <w:tcPr>
+            <w:tcW w:w="605" w:type="dxa"/>
+          </w:tcPr>
+          <w:p>
+            <w:pPr>
+              <w:spacing w:before="0" w:after="0" w:line="240" w:lineRule="auto"/>
+              <w:jc w:val="center"/>
+            </w:pPr>
+          </w:p>
+        </w:tc>
+        <w:tc>
+          <w:tcPr>
+            <w:tcW w:w="608" w:type="dxa"/>
+          </w:tcPr>
+          <w:p>
+            <w:pPr>
+              <w:spacing w:before="0" w:after="0" w:line="240" w:lineRule="auto"/>
+              <w:jc w:val="center"/>
+            </w:pPr>
+          </w:p>
+        </w:tc>
+      </w:tr>
+      <w:tr>
+        <w:tc>
+          <w:tcPr>
+            <w:tcW w:w="550" w:type="dxa"/>
+          </w:tcPr>
+          <w:p>
+            <w:pPr>
+              <w:spacing w:before="0" w:after="0" w:line="240" w:lineRule="auto"/>
+            </w:pPr>
+            <w:r>
+              <w:rPr>
+                <w:sz w:val="16"/>
+              </w:rPr>
+              <w:t>2</w:t>
+            </w:r>
+          </w:p>
+        </w:tc>
+        <w:tc>
+          <w:tcPr>
+            <w:tcW w:w="900" w:type="dxa"/>
+            <w:vMerge/>
+          </w:tcPr>
+          <w:p>
+            <w:pPr>
+              <w:spacing w:before="0" w:after="0" w:line="240" w:lineRule="auto"/>
+            </w:pPr>
+          </w:p>
+        </w:tc>
+        <w:tc>
+          <w:tcPr>
+            <w:tcW w:w="2250" w:type="dxa"/>
+          </w:tcPr>
+          <w:p>
+            <w:pPr>
+              <w:spacing w:before="0" w:after="0" w:line="240" w:lineRule="auto"/>
+            </w:pPr>
+            <w:r>
+              <w:rPr>
+                <w:sz w:val="16"/>
+              </w:rPr>
+              <w:t>Solution Designing – Functional Design Specification (FDS)</w:t>
+            </w:r>
+          </w:p>
+        </w:tc>
+        <w:tc>
+          <w:tcPr>
+            <w:tcW w:w="600" w:type="dxa"/>
+          </w:tcPr>
+          <w:p>
+            <w:pPr>
+              <w:spacing w:before="0" w:after="0" w:line="240" w:lineRule="auto"/>
+              <w:jc w:val="center"/>
+            </w:pPr>
+            <w:r>
+              <w:rPr>
+                <w:sz w:val="16"/>
+              </w:rPr>
+              <w:t>4</w:t>
+            </w:r>
+          </w:p>
+        </w:tc>
+        <w:tc>
+          <w:tcPr>
+            <w:tcW w:w="600" w:type="dxa"/>
+          </w:tcPr>
+          <w:p>
+            <w:pPr>
+              <w:spacing w:before="0" w:after="0" w:line="240" w:lineRule="auto"/>
+              <w:jc w:val="center"/>
+            </w:pPr>
+            <w:r>
+              <w:rPr>
+                <w:sz w:val="16"/>
+              </w:rPr>
+              <w:t>5</w:t>
+            </w:r>
+          </w:p>
+        </w:tc>
+        <w:tc>
+          <w:tcPr>
+            <w:tcW w:w="605" w:type="dxa"/>
+            <w:shd w:val="clear" w:color="auto" w:fill="27166F"/>
+          </w:tcPr>
+          <w:p>
+            <w:pPr>
+              <w:spacing w:before="0" w:after="0" w:line="240" w:lineRule="auto"/>
+              <w:jc w:val="center"/>
+            </w:pPr>
+          </w:p>
+        </w:tc>
+        <w:tc>
+          <w:tcPr>
+            <w:tcW w:w="605" w:type="dxa"/>
+            <w:shd w:val="clear" w:color="auto" w:fill="27166F"/>
+          </w:tcPr>
+          <w:p>
+            <w:pPr>
+              <w:spacing w:before="0" w:after="0" w:line="240" w:lineRule="auto"/>
+              <w:jc w:val="center"/>
+            </w:pPr>
+          </w:p>
+        </w:tc>
+        <w:tc>
+          <w:tcPr>
+            <w:tcW w:w="605" w:type="dxa"/>
+          </w:tcPr>
+          <w:p>
+            <w:pPr>
+              <w:spacing w:before="0" w:after="0" w:line="240" w:lineRule="auto"/>
+              <w:jc w:val="center"/>
+            </w:pPr>
+          </w:p>
+        </w:tc>
+        <w:tc>
+          <w:tcPr>
+            <w:tcW w:w="605" w:type="dxa"/>
+          </w:tcPr>
+          <w:p>
+            <w:pPr>
+              <w:spacing w:before="0" w:after="0" w:line="240" w:lineRule="auto"/>
+              <w:jc w:val="center"/>
+            </w:pPr>
+          </w:p>
+        </w:tc>
+        <w:tc>
+          <w:tcPr>
+            <w:tcW w:w="605" w:type="dxa"/>
+          </w:tcPr>
+          <w:p>
+            <w:pPr>
+              <w:spacing w:before="0" w:after="0" w:line="240" w:lineRule="auto"/>
+              <w:jc w:val="center"/>
+            </w:pPr>
+          </w:p>
+        </w:tc>
+        <w:tc>
+          <w:tcPr>
+            <w:tcW w:w="605" w:type="dxa"/>
+          </w:tcPr>
+          <w:p>
+            <w:pPr>
+              <w:spacing w:before="0" w:after="0" w:line="240" w:lineRule="auto"/>
+              <w:jc w:val="center"/>
+            </w:pPr>
+          </w:p>
+        </w:tc>
+        <w:tc>
+          <w:tcPr>
+            <w:tcW w:w="605" w:type="dxa"/>
+          </w:tcPr>
+          <w:p>
+            <w:pPr>
+              <w:spacing w:before="0" w:after="0" w:line="240" w:lineRule="auto"/>
+              <w:jc w:val="center"/>
+            </w:pPr>
+          </w:p>
+        </w:tc>
+        <w:tc>
+          <w:tcPr>
+            <w:tcW w:w="605" w:type="dxa"/>
+          </w:tcPr>
+          <w:p>
+            <w:pPr>
+              <w:spacing w:before="0" w:after="0" w:line="240" w:lineRule="auto"/>
+              <w:jc w:val="center"/>
+            </w:pPr>
+          </w:p>
+        </w:tc>
+        <w:tc>
+          <w:tcPr>
+            <w:tcW w:w="608" w:type="dxa"/>
+          </w:tcPr>
+          <w:p>
+            <w:pPr>
+              <w:spacing w:before="0" w:after="0" w:line="240" w:lineRule="auto"/>
+              <w:jc w:val="center"/>
+            </w:pPr>
+          </w:p>
+        </w:tc>
+      </w:tr>
+      <w:tr>
+        <w:tc>
+          <w:tcPr>
+            <w:tcW w:w="550" w:type="dxa"/>
+          </w:tcPr>
+          <w:p>
+            <w:pPr>
+              <w:spacing w:before="0" w:after="0" w:line="240" w:lineRule="auto"/>
+            </w:pPr>
+            <w:r>
+              <w:rPr>
+                <w:sz w:val="16"/>
+              </w:rPr>
+              <w:t>3</w:t>
+            </w:r>
+          </w:p>
+        </w:tc>
+        <w:tc>
+          <w:tcPr>
+            <w:tcW w:w="900" w:type="dxa"/>
+            <w:vMerge/>
+          </w:tcPr>
+          <w:p>
+            <w:pPr>
+              <w:spacing w:before="0" w:after="0" w:line="240" w:lineRule="auto"/>
+            </w:pPr>
+          </w:p>
+        </w:tc>
+        <w:tc>
+          <w:tcPr>
+            <w:tcW w:w="2250" w:type="dxa"/>
+          </w:tcPr>
+          <w:p>
+            <w:pPr>
+              <w:spacing w:before="0" w:after="0" w:line="240" w:lineRule="auto"/>
+            </w:pPr>
+            <w:r>
+              <w:rPr>
+                <w:sz w:val="16"/>
+              </w:rPr>
+              <w:t>Interface Designing – Interface Control Document (ICD)</w:t>
+            </w:r>
+          </w:p>
+        </w:tc>
+        <w:tc>
+          <w:tcPr>
+            <w:tcW w:w="600" w:type="dxa"/>
+          </w:tcPr>
+          <w:p>
+            <w:pPr>
+              <w:spacing w:before="0" w:after="0" w:line="240" w:lineRule="auto"/>
+              <w:jc w:val="center"/>
+            </w:pPr>
+            <w:r>
+              <w:rPr>
+                <w:sz w:val="16"/>
+              </w:rPr>
+              <w:t>5</w:t>
+            </w:r>
+          </w:p>
+        </w:tc>
+        <w:tc>
+          <w:tcPr>
+            <w:tcW w:w="600" w:type="dxa"/>
+          </w:tcPr>
+          <w:p>
+            <w:pPr>
+              <w:spacing w:before="0" w:after="0" w:line="240" w:lineRule="auto"/>
+              <w:jc w:val="center"/>
+            </w:pPr>
+            <w:r>
+              <w:rPr>
+                <w:sz w:val="16"/>
+              </w:rPr>
+              <w:t>4</w:t>
+            </w:r>
+          </w:p>
+        </w:tc>
+        <w:tc>
+          <w:tcPr>
+            <w:tcW w:w="605" w:type="dxa"/>
+          </w:tcPr>
+          <w:p>
+            <w:pPr>
+              <w:spacing w:before="0" w:after="0" w:line="240" w:lineRule="auto"/>
+              <w:jc w:val="center"/>
+            </w:pPr>
+          </w:p>
+        </w:tc>
+        <w:tc>
+          <w:tcPr>
+            <w:tcW w:w="605" w:type="dxa"/>
+            <w:shd w:val="clear" w:color="auto" w:fill="27166F"/>
+          </w:tcPr>
+          <w:p>
+            <w:pPr>
+              <w:spacing w:before="0" w:after="0" w:line="240" w:lineRule="auto"/>
+              <w:jc w:val="center"/>
+            </w:pPr>
+          </w:p>
+        </w:tc>
+        <w:tc>
+          <w:tcPr>
+            <w:tcW w:w="605" w:type="dxa"/>
+          </w:tcPr>
+          <w:p>
+            <w:pPr>
+              <w:spacing w:before="0" w:after="0" w:line="240" w:lineRule="auto"/>
+              <w:jc w:val="center"/>
+            </w:pPr>
+          </w:p>
+        </w:tc>
+        <w:tc>
+          <w:tcPr>
+            <w:tcW w:w="605" w:type="dxa"/>
+          </w:tcPr>
+          <w:p>
+            <w:pPr>
+              <w:spacing w:before="0" w:after="0" w:line="240" w:lineRule="auto"/>
+              <w:jc w:val="center"/>
+            </w:pPr>
+          </w:p>
+        </w:tc>
+        <w:tc>
+          <w:tcPr>
+            <w:tcW w:w="605" w:type="dxa"/>
+          </w:tcPr>
+          <w:p>
+            <w:pPr>
+              <w:spacing w:before="0" w:after="0" w:line="240" w:lineRule="auto"/>
+              <w:jc w:val="center"/>
+            </w:pPr>
+          </w:p>
+        </w:tc>
+        <w:tc>
+          <w:tcPr>
+            <w:tcW w:w="605" w:type="dxa"/>
+          </w:tcPr>
+          <w:p>
+            <w:pPr>
+              <w:spacing w:before="0" w:after="0" w:line="240" w:lineRule="auto"/>
+              <w:jc w:val="center"/>
+            </w:pPr>
+          </w:p>
+        </w:tc>
+        <w:tc>
+          <w:tcPr>
+            <w:tcW w:w="605" w:type="dxa"/>
+          </w:tcPr>
+          <w:p>
+            <w:pPr>
+              <w:spacing w:before="0" w:after="0" w:line="240" w:lineRule="auto"/>
+              <w:jc w:val="center"/>
+            </w:pPr>
+          </w:p>
+        </w:tc>
+        <w:tc>
+          <w:tcPr>
+            <w:tcW w:w="605" w:type="dxa"/>
+          </w:tcPr>
+          <w:p>
+            <w:pPr>
+              <w:spacing w:before="0" w:after="0" w:line="240" w:lineRule="auto"/>
+              <w:jc w:val="center"/>
+            </w:pPr>
+          </w:p>
+        </w:tc>
+        <w:tc>
+          <w:tcPr>
+            <w:tcW w:w="608" w:type="dxa"/>
+          </w:tcPr>
+          <w:p>
+            <w:pPr>
+              <w:spacing w:before="0" w:after="0" w:line="240" w:lineRule="auto"/>
+              <w:jc w:val="center"/>
+            </w:pPr>
+          </w:p>
+        </w:tc>
+      </w:tr>
+      <w:tr>
+        <w:tc>
+          <w:tcPr>
+            <w:tcW w:w="550" w:type="dxa"/>
+          </w:tcPr>
+          <w:p>
+            <w:pPr>
+              <w:spacing w:before="0" w:after="0" w:line="240" w:lineRule="auto"/>
+            </w:pPr>
+            <w:r>
+              <w:rPr>
+                <w:sz w:val="16"/>
+              </w:rPr>
+              <w:t>4</w:t>
+            </w:r>
+          </w:p>
+        </w:tc>
+        <w:tc>
+          <w:tcPr>
+            <w:tcW w:w="900" w:type="dxa"/>
+            <w:vMerge/>
+          </w:tcPr>
+          <w:p>
+            <w:pPr>
+              <w:spacing w:before="0" w:after="0" w:line="240" w:lineRule="auto"/>
+            </w:pPr>
+          </w:p>
+        </w:tc>
+        <w:tc>
+          <w:tcPr>
+            <w:tcW w:w="2250" w:type="dxa"/>
+          </w:tcPr>
+          <w:p>
+            <w:pPr>
+              <w:spacing w:before="0" w:after="0" w:line="240" w:lineRule="auto"/>
+            </w:pPr>
+            <w:r>
+              <w:rPr>
+                <w:sz w:val="16"/>
+              </w:rPr>
+              <w:t>Solution Development and Demonstration (DEMO)</w:t>
+            </w:r>
+          </w:p>
+        </w:tc>
+        <w:tc>
+          <w:tcPr>
+            <w:tcW w:w="600" w:type="dxa"/>
+          </w:tcPr>
+          <w:p>
+            <w:pPr>
+              <w:spacing w:before="0" w:after="0" w:line="240" w:lineRule="auto"/>
+              <w:jc w:val="center"/>
+            </w:pPr>
+            <w:r>
+              <w:rPr>
+                <w:sz w:val="16"/>
+              </w:rPr>
+              <w:t>9</w:t>
+            </w:r>
+          </w:p>
+        </w:tc>
+        <w:tc>
+          <w:tcPr>
+            <w:tcW w:w="600" w:type="dxa"/>
+          </w:tcPr>
+          <w:p>
+            <w:pPr>
+              <w:spacing w:before="0" w:after="0" w:line="240" w:lineRule="auto"/>
+              <w:jc w:val="center"/>
+            </w:pPr>
+            <w:r>
+              <w:rPr>
+                <w:sz w:val="16"/>
+              </w:rPr>
+              <w:t>12</w:t>
+            </w:r>
+          </w:p>
+        </w:tc>
+        <w:tc>
+          <w:tcPr>
+            <w:tcW w:w="605" w:type="dxa"/>
+          </w:tcPr>
+          <w:p>
+            <w:pPr>
+              <w:spacing w:before="0" w:after="0" w:line="240" w:lineRule="auto"/>
+              <w:jc w:val="center"/>
+            </w:pPr>
+          </w:p>
+        </w:tc>
+        <w:tc>
+          <w:tcPr>
+            <w:tcW w:w="605" w:type="dxa"/>
+            <w:shd w:val="clear" w:color="auto" w:fill="27166F"/>
+          </w:tcPr>
+          <w:p>
+            <w:pPr>
+              <w:spacing w:before="0" w:after="0" w:line="240" w:lineRule="auto"/>
+              <w:jc w:val="center"/>
+            </w:pPr>
+          </w:p>
+        </w:tc>
+        <w:tc>
+          <w:tcPr>
+            <w:tcW w:w="605" w:type="dxa"/>
+            <w:shd w:val="clear" w:color="auto" w:fill="27166F"/>
+          </w:tcPr>
+          <w:p>
+            <w:pPr>
+              <w:spacing w:before="0" w:after="0" w:line="240" w:lineRule="auto"/>
+              <w:jc w:val="center"/>
+            </w:pPr>
+          </w:p>
+        </w:tc>
+        <w:tc>
+          <w:tcPr>
+            <w:tcW w:w="605" w:type="dxa"/>
+            <w:shd w:val="clear" w:color="auto" w:fill="27166F"/>
+          </w:tcPr>
+          <w:p>
+            <w:pPr>
+              <w:spacing w:before="0" w:after="0" w:line="240" w:lineRule="auto"/>
+              <w:jc w:val="center"/>
+            </w:pPr>
+          </w:p>
+        </w:tc>
+        <w:tc>
+          <w:tcPr>
+            <w:tcW w:w="605" w:type="dxa"/>
+            <w:shd w:val="clear" w:color="auto" w:fill="27166F"/>
+          </w:tcPr>
+          <w:p>
+            <w:pPr>
+              <w:spacing w:before="0" w:after="0" w:line="240" w:lineRule="auto"/>
+              <w:jc w:val="center"/>
+            </w:pPr>
+          </w:p>
+        </w:tc>
+        <w:tc>
+          <w:tcPr>
+            <w:tcW w:w="605" w:type="dxa"/>
+          </w:tcPr>
+          <w:p>
+            <w:pPr>
+              <w:spacing w:before="0" w:after="0" w:line="240" w:lineRule="auto"/>
+              <w:jc w:val="center"/>
+            </w:pPr>
+          </w:p>
+        </w:tc>
+        <w:tc>
+          <w:tcPr>
+            <w:tcW w:w="605" w:type="dxa"/>
+          </w:tcPr>
+          <w:p>
+            <w:pPr>
+              <w:spacing w:before="0" w:after="0" w:line="240" w:lineRule="auto"/>
+              <w:jc w:val="center"/>
+            </w:pPr>
+          </w:p>
+        </w:tc>
+        <w:tc>
+          <w:tcPr>
+            <w:tcW w:w="605" w:type="dxa"/>
+          </w:tcPr>
+          <w:p>
+            <w:pPr>
+              <w:spacing w:before="0" w:after="0" w:line="240" w:lineRule="auto"/>
+              <w:jc w:val="center"/>
+            </w:pPr>
+          </w:p>
+        </w:tc>
+        <w:tc>
+          <w:tcPr>
+            <w:tcW w:w="608" w:type="dxa"/>
+          </w:tcPr>
+          <w:p>
+            <w:pPr>
+              <w:spacing w:before="0" w:after="0" w:line="240" w:lineRule="auto"/>
+              <w:jc w:val="center"/>
+            </w:pPr>
+          </w:p>
+        </w:tc>
+      </w:tr>
+      <w:tr>
+        <w:tc>
+          <w:tcPr>
+            <w:tcW w:w="550" w:type="dxa"/>
+          </w:tcPr>
+          <w:p>
+            <w:pPr>
+              <w:spacing w:before="0" w:after="0" w:line="240" w:lineRule="auto"/>
+            </w:pPr>
+            <w:r>
+              <w:rPr>
+                <w:sz w:val="16"/>
+              </w:rPr>
+              <w:t>5</w:t>
+            </w:r>
+          </w:p>
+        </w:tc>
+        <w:tc>
+          <w:tcPr>
+            <w:tcW w:w="900" w:type="dxa"/>
+            <w:vMerge/>
+          </w:tcPr>
+          <w:p>
+            <w:pPr>
+              <w:spacing w:before="0" w:after="0" w:line="240" w:lineRule="auto"/>
+            </w:pPr>
+          </w:p>
+        </w:tc>
+        <w:tc>
+          <w:tcPr>
+            <w:tcW w:w="2250" w:type="dxa"/>
+          </w:tcPr>
+          <w:p>
+            <w:pPr>
+              <w:spacing w:before="0" w:after="0" w:line="240" w:lineRule="auto"/>
+            </w:pPr>
+            <w:r>
+              <w:rPr>
+                <w:sz w:val="16"/>
+              </w:rPr>
+              <w:t>System Integration Testing (SIT)</w:t>
+            </w:r>
+          </w:p>
+        </w:tc>
+        <w:tc>
+          <w:tcPr>
+            <w:tcW w:w="600" w:type="dxa"/>
+          </w:tcPr>
+          <w:p>
+            <w:pPr>
+              <w:spacing w:before="0" w:after="0" w:line="240" w:lineRule="auto"/>
+              <w:jc w:val="center"/>
+            </w:pPr>
+            <w:r>
+              <w:rPr>
+                <w:sz w:val="16"/>
+              </w:rPr>
+              <w:t>19</w:t>
+            </w:r>
+          </w:p>
+        </w:tc>
+        <w:tc>
+          <w:tcPr>
+            <w:tcW w:w="600" w:type="dxa"/>
+          </w:tcPr>
+          <w:p>
+            <w:pPr>
+              <w:spacing w:before="0" w:after="0" w:line="240" w:lineRule="auto"/>
+              <w:jc w:val="center"/>
+            </w:pPr>
+            <w:r>
+              <w:rPr>
+                <w:sz w:val="16"/>
+              </w:rPr>
+              <w:t>5</w:t>
+            </w:r>
+          </w:p>
+        </w:tc>
+        <w:tc>
+          <w:tcPr>
+            <w:tcW w:w="605" w:type="dxa"/>
+          </w:tcPr>
+          <w:p>
+            <w:pPr>
+              <w:spacing w:before="0" w:after="0" w:line="240" w:lineRule="auto"/>
+              <w:jc w:val="center"/>
+            </w:pPr>
+          </w:p>
+        </w:tc>
+        <w:tc>
+          <w:tcPr>
+            <w:tcW w:w="605" w:type="dxa"/>
+          </w:tcPr>
+          <w:p>
+            <w:pPr>
+              <w:spacing w:before="0" w:after="0" w:line="240" w:lineRule="auto"/>
+              <w:jc w:val="center"/>
+            </w:pPr>
+          </w:p>
+        </w:tc>
+        <w:tc>
+          <w:tcPr>
+            <w:tcW w:w="605" w:type="dxa"/>
+          </w:tcPr>
+          <w:p>
+            <w:pPr>
+              <w:spacing w:before="0" w:after="0" w:line="240" w:lineRule="auto"/>
+              <w:jc w:val="center"/>
+            </w:pPr>
+          </w:p>
+        </w:tc>
+        <w:tc>
+          <w:tcPr>
+            <w:tcW w:w="605" w:type="dxa"/>
+          </w:tcPr>
+          <w:p>
+            <w:pPr>
+              <w:spacing w:before="0" w:after="0" w:line="240" w:lineRule="auto"/>
+              <w:jc w:val="center"/>
+            </w:pPr>
+          </w:p>
+        </w:tc>
+        <w:tc>
+          <w:tcPr>
+            <w:tcW w:w="605" w:type="dxa"/>
+            <w:shd w:val="clear" w:color="auto" w:fill="27166F"/>
+          </w:tcPr>
+          <w:p>
+            <w:pPr>
+              <w:spacing w:before="0" w:after="0" w:line="240" w:lineRule="auto"/>
+              <w:jc w:val="center"/>
+            </w:pPr>
+          </w:p>
+        </w:tc>
+        <w:tc>
+          <w:tcPr>
+            <w:tcW w:w="605" w:type="dxa"/>
+            <w:shd w:val="clear" w:color="auto" w:fill="27166F"/>
+          </w:tcPr>
+          <w:p>
+            <w:pPr>
+              <w:spacing w:before="0" w:after="0" w:line="240" w:lineRule="auto"/>
+              <w:jc w:val="center"/>
+            </w:pPr>
+          </w:p>
+        </w:tc>
+        <w:tc>
+          <w:tcPr>
+            <w:tcW w:w="605" w:type="dxa"/>
+          </w:tcPr>
+          <w:p>
+            <w:pPr>
+              <w:spacing w:before="0" w:after="0" w:line="240" w:lineRule="auto"/>
+              <w:jc w:val="center"/>
+            </w:pPr>
+          </w:p>
+        </w:tc>
+        <w:tc>
+          <w:tcPr>
+            <w:tcW w:w="605" w:type="dxa"/>
+          </w:tcPr>
+          <w:p>
+            <w:pPr>
+              <w:spacing w:before="0" w:after="0" w:line="240" w:lineRule="auto"/>
+              <w:jc w:val="center"/>
+            </w:pPr>
+          </w:p>
+        </w:tc>
+        <w:tc>
+          <w:tcPr>
+            <w:tcW w:w="608" w:type="dxa"/>
+          </w:tcPr>
+          <w:p>
+            <w:pPr>
+              <w:spacing w:before="0" w:after="0" w:line="240" w:lineRule="auto"/>
+              <w:jc w:val="center"/>
+            </w:pPr>
+          </w:p>
+        </w:tc>
+      </w:tr>
+      <w:tr>
+        <w:tc>
+          <w:tcPr>
+            <w:tcW w:w="550" w:type="dxa"/>
+          </w:tcPr>
+          <w:p>
+            <w:pPr>
+              <w:spacing w:before="0" w:after="0" w:line="240" w:lineRule="auto"/>
+            </w:pPr>
+            <w:r>
+              <w:rPr>
+                <w:sz w:val="16"/>
+              </w:rPr>
+              <w:t>6</w:t>
+            </w:r>
+          </w:p>
+        </w:tc>
+        <w:tc>
+          <w:tcPr>
+            <w:tcW w:w="900" w:type="dxa"/>
+            <w:vMerge/>
+          </w:tcPr>
+          <w:p>
+            <w:pPr>
+              <w:spacing w:before="0" w:after="0" w:line="240" w:lineRule="auto"/>
+            </w:pPr>
+          </w:p>
+        </w:tc>
+        <w:tc>
+          <w:tcPr>
+            <w:tcW w:w="2250" w:type="dxa"/>
+          </w:tcPr>
+          <w:p>
+            <w:pPr>
+              <w:spacing w:before="0" w:after="0" w:line="240" w:lineRule="auto"/>
+            </w:pPr>
+            <w:r>
+              <w:rPr>
+                <w:sz w:val="16"/>
+              </w:rPr>
+              <w:t>User Acceptance Testing (UAT)</w:t>
+            </w:r>
+          </w:p>
+        </w:tc>
+        <w:tc>
+          <w:tcPr>
+            <w:tcW w:w="600" w:type="dxa"/>
+          </w:tcPr>
+          <w:p>
+            <w:pPr>
+              <w:spacing w:before="0" w:after="0" w:line="240" w:lineRule="auto"/>
+              <w:jc w:val="center"/>
+            </w:pPr>
+            <w:r>
+              <w:rPr>
+                <w:sz w:val="16"/>
+              </w:rPr>
+              <w:t>24</w:t>
+            </w:r>
+          </w:p>
+        </w:tc>
+        <w:tc>
+          <w:tcPr>
+            <w:tcW w:w="600" w:type="dxa"/>
+          </w:tcPr>
+          <w:p>
+            <w:pPr>
+              <w:spacing w:before="0" w:after="0" w:line="240" w:lineRule="auto"/>
+              <w:jc w:val="center"/>
+            </w:pPr>
+            <w:r>
+              <w:rPr>
+                <w:sz w:val="16"/>
+              </w:rPr>
+              <w:t>5</w:t>
+            </w:r>
+          </w:p>
+        </w:tc>
+        <w:tc>
+          <w:tcPr>
+            <w:tcW w:w="605" w:type="dxa"/>
+          </w:tcPr>
+          <w:p>
+            <w:pPr>
+              <w:spacing w:before="0" w:after="0" w:line="240" w:lineRule="auto"/>
+              <w:jc w:val="center"/>
+            </w:pPr>
+          </w:p>
+        </w:tc>
+        <w:tc>
+          <w:tcPr>
+            <w:tcW w:w="605" w:type="dxa"/>
+          </w:tcPr>
+          <w:p>
+            <w:pPr>
+              <w:spacing w:before="0" w:after="0" w:line="240" w:lineRule="auto"/>
+              <w:jc w:val="center"/>
+            </w:pPr>
+          </w:p>
+        </w:tc>
+        <w:tc>
+          <w:tcPr>
+            <w:tcW w:w="605" w:type="dxa"/>
+          </w:tcPr>
+          <w:p>
+            <w:pPr>
+              <w:spacing w:before="0" w:after="0" w:line="240" w:lineRule="auto"/>
+              <w:jc w:val="center"/>
+            </w:pPr>
+          </w:p>
+        </w:tc>
+        <w:tc>
+          <w:tcPr>
+            <w:tcW w:w="605" w:type="dxa"/>
+          </w:tcPr>
+          <w:p>
+            <w:pPr>
+              <w:spacing w:before="0" w:after="0" w:line="240" w:lineRule="auto"/>
+              <w:jc w:val="center"/>
+            </w:pPr>
+          </w:p>
+        </w:tc>
+        <w:tc>
+          <w:tcPr>
+            <w:tcW w:w="605" w:type="dxa"/>
+          </w:tcPr>
+          <w:p>
+            <w:pPr>
+              <w:spacing w:before="0" w:after="0" w:line="240" w:lineRule="auto"/>
+              <w:jc w:val="center"/>
+            </w:pPr>
+          </w:p>
+        </w:tc>
+        <w:tc>
+          <w:tcPr>
+            <w:tcW w:w="605" w:type="dxa"/>
+            <w:shd w:val="clear" w:color="auto" w:fill="27166F"/>
+          </w:tcPr>
+          <w:p>
+            <w:pPr>
+              <w:spacing w:before="0" w:after="0" w:line="240" w:lineRule="auto"/>
+              <w:jc w:val="center"/>
+            </w:pPr>
+          </w:p>
+        </w:tc>
+        <w:tc>
+          <w:tcPr>
+            <w:tcW w:w="605" w:type="dxa"/>
+            <w:shd w:val="clear" w:color="auto" w:fill="27166F"/>
+          </w:tcPr>
+          <w:p>
+            <w:pPr>
+              <w:spacing w:before="0" w:after="0" w:line="240" w:lineRule="auto"/>
+              <w:jc w:val="center"/>
+            </w:pPr>
+          </w:p>
+        </w:tc>
+        <w:tc>
+          <w:tcPr>
+            <w:tcW w:w="605" w:type="dxa"/>
+          </w:tcPr>
+          <w:p>
+            <w:pPr>
+              <w:spacing w:before="0" w:after="0" w:line="240" w:lineRule="auto"/>
+              <w:jc w:val="center"/>
+            </w:pPr>
+          </w:p>
+        </w:tc>
+        <w:tc>
+          <w:tcPr>
+            <w:tcW w:w="608" w:type="dxa"/>
+          </w:tcPr>
+          <w:p>
+            <w:pPr>
+              <w:spacing w:before="0" w:after="0" w:line="240" w:lineRule="auto"/>
+              <w:jc w:val="center"/>
+            </w:pPr>
+          </w:p>
+        </w:tc>
+      </w:tr>
+      <w:tr>
+        <w:tc>
+          <w:tcPr>
+            <w:tcW w:w="550" w:type="dxa"/>
+          </w:tcPr>
+          <w:p>
+            <w:pPr>
+              <w:spacing w:before="0" w:after="0" w:line="240" w:lineRule="auto"/>
+            </w:pPr>
+            <w:r>
+              <w:rPr>
+                <w:sz w:val="16"/>
+              </w:rPr>
+              <w:t>7</w:t>
+            </w:r>
+          </w:p>
+        </w:tc>
+        <w:tc>
+          <w:tcPr>
+            <w:tcW w:w="900" w:type="dxa"/>
+            <w:vMerge/>
+          </w:tcPr>
+          <w:p>
+            <w:pPr>
+              <w:spacing w:before="0" w:after="0" w:line="240" w:lineRule="auto"/>
+            </w:pPr>
+          </w:p>
+        </w:tc>
+        <w:tc>
+          <w:tcPr>
+            <w:tcW w:w="2250" w:type="dxa"/>
+          </w:tcPr>
+          <w:p>
+            <w:pPr>
+              <w:spacing w:before="0" w:after="0" w:line="240" w:lineRule="auto"/>
+            </w:pPr>
+            <w:r>
+              <w:rPr>
+                <w:sz w:val="16"/>
+              </w:rPr>
+              <w:t>Commissioning and Go Live</w:t>
+            </w:r>
+          </w:p>
+        </w:tc>
+        <w:tc>
+          <w:tcPr>
+            <w:tcW w:w="600" w:type="dxa"/>
+          </w:tcPr>
+          <w:p>
+            <w:pPr>
+              <w:spacing w:before="0" w:after="0" w:line="240" w:lineRule="auto"/>
+              <w:jc w:val="center"/>
+            </w:pPr>
+            <w:r>
+              <w:rPr>
+                <w:sz w:val="16"/>
+              </w:rPr>
+              <w:t>29</w:t>
+            </w:r>
+          </w:p>
+        </w:tc>
+        <w:tc>
+          <w:tcPr>
+            <w:tcW w:w="600" w:type="dxa"/>
+          </w:tcPr>
+          <w:p>
+            <w:pPr>
+              <w:spacing w:before="0" w:after="0" w:line="240" w:lineRule="auto"/>
+              <w:jc w:val="center"/>
+            </w:pPr>
+            <w:r>
+              <w:rPr>
+                <w:sz w:val="16"/>
+              </w:rPr>
+              <w:t>3</w:t>
+            </w:r>
+          </w:p>
+        </w:tc>
+        <w:tc>
+          <w:tcPr>
+            <w:tcW w:w="605" w:type="dxa"/>
+          </w:tcPr>
+          <w:p>
+            <w:pPr>
+              <w:spacing w:before="0" w:after="0" w:line="240" w:lineRule="auto"/>
+              <w:jc w:val="center"/>
+            </w:pPr>
+          </w:p>
+        </w:tc>
+        <w:tc>
+          <w:tcPr>
+            <w:tcW w:w="605" w:type="dxa"/>
+          </w:tcPr>
+          <w:p>
+            <w:pPr>
+              <w:spacing w:before="0" w:after="0" w:line="240" w:lineRule="auto"/>
+              <w:jc w:val="center"/>
+            </w:pPr>
+          </w:p>
+        </w:tc>
+        <w:tc>
+          <w:tcPr>
+            <w:tcW w:w="605" w:type="dxa"/>
+          </w:tcPr>
+          <w:p>
+            <w:pPr>
+              <w:spacing w:before="0" w:after="0" w:line="240" w:lineRule="auto"/>
+              <w:jc w:val="center"/>
+            </w:pPr>
+          </w:p>
+        </w:tc>
+        <w:tc>
+          <w:tcPr>
+            <w:tcW w:w="605" w:type="dxa"/>
+          </w:tcPr>
+          <w:p>
+            <w:pPr>
+              <w:spacing w:before="0" w:after="0" w:line="240" w:lineRule="auto"/>
+              <w:jc w:val="center"/>
+            </w:pPr>
+          </w:p>
+        </w:tc>
+        <w:tc>
+          <w:tcPr>
+            <w:tcW w:w="605" w:type="dxa"/>
+          </w:tcPr>
+          <w:p>
+            <w:pPr>
+              <w:spacing w:before="0" w:after="0" w:line="240" w:lineRule="auto"/>
+              <w:jc w:val="center"/>
+            </w:pPr>
+          </w:p>
+        </w:tc>
+        <w:tc>
+          <w:tcPr>
+            <w:tcW w:w="605" w:type="dxa"/>
+          </w:tcPr>
+          <w:p>
+            <w:pPr>
+              <w:spacing w:before="0" w:after="0" w:line="240" w:lineRule="auto"/>
+              <w:jc w:val="center"/>
+            </w:pPr>
+          </w:p>
+        </w:tc>
+        <w:tc>
+          <w:tcPr>
+            <w:tcW w:w="605" w:type="dxa"/>
+            <w:shd w:val="clear" w:color="auto" w:fill="27166F"/>
+          </w:tcPr>
+          <w:p>
+            <w:pPr>
+              <w:spacing w:before="0" w:after="0" w:line="240" w:lineRule="auto"/>
+              <w:jc w:val="center"/>
+            </w:pPr>
+          </w:p>
+        </w:tc>
+        <w:tc>
+          <w:tcPr>
+            <w:tcW w:w="605" w:type="dxa"/>
+            <w:shd w:val="clear" w:color="auto" w:fill="27166F"/>
+          </w:tcPr>
+          <w:p>
+            <w:pPr>
+              <w:spacing w:before="0" w:after="0" w:line="240" w:lineRule="auto"/>
+              <w:jc w:val="center"/>
+            </w:pPr>
+          </w:p>
+        </w:tc>
+        <w:tc>
+          <w:tcPr>
+            <w:tcW w:w="608" w:type="dxa"/>
+          </w:tcPr>
+          <w:p>
+            <w:pPr>
+              <w:spacing w:before="0" w:after="0" w:line="240" w:lineRule="auto"/>
+              <w:jc w:val="center"/>
+            </w:pPr>
+          </w:p>
+        </w:tc>
+      </w:tr>
+      <w:tr>
+        <w:tc>
+          <w:tcPr>
+            <w:tcW w:w="550" w:type="dxa"/>
+          </w:tcPr>
+          <w:p>
+            <w:pPr>
+              <w:spacing w:before="0" w:after="0" w:line="240" w:lineRule="auto"/>
+            </w:pPr>
+            <w:r>
+              <w:rPr>
+                <w:sz w:val="16"/>
+              </w:rPr>
+              <w:t>8</w:t>
+            </w:r>
+          </w:p>
+        </w:tc>
+        <w:tc>
+          <w:tcPr>
+            <w:tcW w:w="900" w:type="dxa"/>
+            <w:vMerge/>
+          </w:tcPr>
+          <w:p>
+            <w:pPr>
+              <w:spacing w:before="0" w:after="0" w:line="240" w:lineRule="auto"/>
+            </w:pPr>
+          </w:p>
+        </w:tc>
+        <w:tc>
+          <w:tcPr>
+            <w:tcW w:w="2250" w:type="dxa"/>
+          </w:tcPr>
+          <w:p>
+            <w:pPr>
+              <w:spacing w:before="0" w:after="0" w:line="240" w:lineRule="auto"/>
+            </w:pPr>
+            <w:r>
+              <w:rPr>
+                <w:sz w:val="16"/>
+              </w:rPr>
+              <w:t>Hyper Care</w:t>
+            </w:r>
+          </w:p>
+        </w:tc>
+        <w:tc>
+          <w:tcPr>
+            <w:tcW w:w="600" w:type="dxa"/>
+          </w:tcPr>
+          <w:p>
+            <w:pPr>
+              <w:spacing w:before="0" w:after="0" w:line="240" w:lineRule="auto"/>
+              <w:jc w:val="center"/>
+            </w:pPr>
+            <w:r>
+              <w:rPr>
+                <w:sz w:val="16"/>
+              </w:rPr>
+              <w:t>32</w:t>
+            </w:r>
+          </w:p>
+        </w:tc>
+        <w:tc>
+          <w:tcPr>
+            <w:tcW w:w="600" w:type="dxa"/>
+          </w:tcPr>
+          <w:p>
+            <w:pPr>
+              <w:spacing w:before="0" w:after="0" w:line="240" w:lineRule="auto"/>
+              <w:jc w:val="center"/>
+            </w:pPr>
+            <w:r>
+              <w:rPr>
+                <w:sz w:val="16"/>
+              </w:rPr>
+              <w:t>6</w:t>
+            </w:r>
+          </w:p>
+        </w:tc>
+        <w:tc>
+          <w:tcPr>
+            <w:tcW w:w="605" w:type="dxa"/>
+          </w:tcPr>
+          <w:p>
+            <w:pPr>
+              <w:spacing w:before="0" w:after="0" w:line="240" w:lineRule="auto"/>
+              <w:jc w:val="center"/>
+            </w:pPr>
+          </w:p>
+        </w:tc>
+        <w:tc>
+          <w:tcPr>
+            <w:tcW w:w="605" w:type="dxa"/>
+          </w:tcPr>
+          <w:p>
+            <w:pPr>
+              <w:spacing w:before="0" w:after="0" w:line="240" w:lineRule="auto"/>
+              <w:jc w:val="center"/>
+            </w:pPr>
+          </w:p>
+        </w:tc>
+        <w:tc>
+          <w:tcPr>
+            <w:tcW w:w="605" w:type="dxa"/>
+          </w:tcPr>
+          <w:p>
+            <w:pPr>
+              <w:spacing w:before="0" w:after="0" w:line="240" w:lineRule="auto"/>
+              <w:jc w:val="center"/>
+            </w:pPr>
+          </w:p>
+        </w:tc>
+        <w:tc>
+          <w:tcPr>
+            <w:tcW w:w="605" w:type="dxa"/>
+          </w:tcPr>
+          <w:p>
+            <w:pPr>
+              <w:spacing w:before="0" w:after="0" w:line="240" w:lineRule="auto"/>
+              <w:jc w:val="center"/>
+            </w:pPr>
+          </w:p>
+        </w:tc>
+        <w:tc>
+          <w:tcPr>
+            <w:tcW w:w="605" w:type="dxa"/>
+          </w:tcPr>
+          <w:p>
+            <w:pPr>
+              <w:spacing w:before="0" w:after="0" w:line="240" w:lineRule="auto"/>
+              <w:jc w:val="center"/>
+            </w:pPr>
+          </w:p>
+        </w:tc>
+        <w:tc>
+          <w:tcPr>
+            <w:tcW w:w="605" w:type="dxa"/>
+          </w:tcPr>
+          <w:p>
+            <w:pPr>
+              <w:spacing w:before="0" w:after="0" w:line="240" w:lineRule="auto"/>
+              <w:jc w:val="center"/>
+            </w:pPr>
+          </w:p>
+        </w:tc>
+        <w:tc>
+          <w:tcPr>
+            <w:tcW w:w="605" w:type="dxa"/>
+          </w:tcPr>
+          <w:p>
+            <w:pPr>
+              <w:spacing w:before="0" w:after="0" w:line="240" w:lineRule="auto"/>
+              <w:jc w:val="center"/>
+            </w:pPr>
+          </w:p>
+        </w:tc>
+        <w:tc>
+          <w:tcPr>
+            <w:tcW w:w="605" w:type="dxa"/>
+            <w:shd w:val="clear" w:color="auto" w:fill="27166F"/>
+          </w:tcPr>
+          <w:p>
+            <w:pPr>
+              <w:spacing w:before="0" w:after="0" w:line="240" w:lineRule="auto"/>
+              <w:jc w:val="center"/>
+            </w:pPr>
+          </w:p>
+        </w:tc>
+        <w:tc>
+          <w:tcPr>
+            <w:tcW w:w="608" w:type="dxa"/>
+            <w:shd w:val="clear" w:color="auto" w:fill="27166F"/>
+          </w:tcPr>
+          <w:p>
+            <w:pPr>
+              <w:spacing w:before="0" w:after="0" w:line="240" w:lineRule="auto"/>
+              <w:jc w:val="center"/>
+            </w:pPr>
+          </w:p>
+        </w:tc>
+      </w:tr>
+      <w:tr>
+        <w:tc>
+          <w:tcPr>
+            <w:tcW w:w="550" w:type="dxa"/>
+          </w:tcPr>
+          <w:p>
+            <w:pPr>
+              <w:spacing w:before="0" w:after="0" w:line="240" w:lineRule="auto"/>
+            </w:pPr>
+            <w:r>
+              <w:rPr>
+                <w:sz w:val="16"/>
+              </w:rPr>
+              <w:t>9</w:t>
+            </w:r>
+          </w:p>
+        </w:tc>
+        <w:tc>
+          <w:tcPr>
+            <w:tcW w:w="900" w:type="dxa"/>
+            <w:vMerge/>
+          </w:tcPr>
+          <w:p>
+            <w:pPr>
+              <w:spacing w:before="0" w:after="0" w:line="240" w:lineRule="auto"/>
+            </w:pPr>
+          </w:p>
+        </w:tc>
+        <w:tc>
+          <w:tcPr>
+            <w:tcW w:w="2250" w:type="dxa"/>
+          </w:tcPr>
+          <w:p>
+            <w:pPr>
+              <w:spacing w:before="0" w:after="0" w:line="240" w:lineRule="auto"/>
+            </w:pPr>
+            <w:r>
+              <w:rPr>
+                <w:sz w:val="16"/>
+              </w:rPr>
+              <w:t>Project Handover</w:t>
+            </w:r>
+          </w:p>
+        </w:tc>
+        <w:tc>
+          <w:tcPr>
+            <w:tcW w:w="600" w:type="dxa"/>
+          </w:tcPr>
+          <w:p>
+            <w:pPr>
+              <w:spacing w:before="0" w:after="0" w:line="240" w:lineRule="auto"/>
+              <w:jc w:val="center"/>
+            </w:pPr>
+            <w:r>
+              <w:rPr>
+                <w:sz w:val="16"/>
+              </w:rPr>
+              <w:t>38</w:t>
+            </w:r>
+          </w:p>
+        </w:tc>
+        <w:tc>
+          <w:tcPr>
+            <w:tcW w:w="600" w:type="dxa"/>
+          </w:tcPr>
+          <w:p>
+            <w:pPr>
+              <w:spacing w:before="0" w:after="0" w:line="240" w:lineRule="auto"/>
+              <w:jc w:val="center"/>
+            </w:pPr>
+            <w:r>
+              <w:rPr>
+                <w:sz w:val="16"/>
+              </w:rPr>
+              <w:t>2</w:t>
+            </w:r>
+          </w:p>
+        </w:tc>
+        <w:tc>
+          <w:tcPr>
+            <w:tcW w:w="605" w:type="dxa"/>
+          </w:tcPr>
+          <w:p>
+            <w:pPr>
+              <w:spacing w:before="0" w:after="0" w:line="240" w:lineRule="auto"/>
+              <w:jc w:val="center"/>
+            </w:pPr>
+          </w:p>
+        </w:tc>
+        <w:tc>
+          <w:tcPr>
+            <w:tcW w:w="605" w:type="dxa"/>
+          </w:tcPr>
+          <w:p>
+            <w:pPr>
+              <w:spacing w:before="0" w:after="0" w:line="240" w:lineRule="auto"/>
+              <w:jc w:val="center"/>
+            </w:pPr>
+          </w:p>
+        </w:tc>
+        <w:tc>
+          <w:tcPr>
+            <w:tcW w:w="605" w:type="dxa"/>
+          </w:tcPr>
+          <w:p>
+            <w:pPr>
+              <w:spacing w:before="0" w:after="0" w:line="240" w:lineRule="auto"/>
+              <w:jc w:val="center"/>
+            </w:pPr>
+          </w:p>
+        </w:tc>
+        <w:tc>
+          <w:tcPr>
+            <w:tcW w:w="605" w:type="dxa"/>
+          </w:tcPr>
+          <w:p>
+            <w:pPr>
+              <w:spacing w:before="0" w:after="0" w:line="240" w:lineRule="auto"/>
+              <w:jc w:val="center"/>
+            </w:pPr>
+          </w:p>
+        </w:tc>
+        <w:tc>
+          <w:tcPr>
+            <w:tcW w:w="605" w:type="dxa"/>
+          </w:tcPr>
+          <w:p>
+            <w:pPr>
+              <w:spacing w:before="0" w:after="0" w:line="240" w:lineRule="auto"/>
+              <w:jc w:val="center"/>
+            </w:pPr>
+          </w:p>
+        </w:tc>
+        <w:tc>
+          <w:tcPr>
+            <w:tcW w:w="605" w:type="dxa"/>
+          </w:tcPr>
+          <w:p>
+            <w:pPr>
+              <w:spacing w:before="0" w:after="0" w:line="240" w:lineRule="auto"/>
+              <w:jc w:val="center"/>
+            </w:pPr>
+          </w:p>
+        </w:tc>
+        <w:tc>
+          <w:tcPr>
+            <w:tcW w:w="605" w:type="dxa"/>
+          </w:tcPr>
+          <w:p>
+            <w:pPr>
+              <w:spacing w:before="0" w:after="0" w:line="240" w:lineRule="auto"/>
+              <w:jc w:val="center"/>
+            </w:pPr>
+          </w:p>
+        </w:tc>
+        <w:tc>
+          <w:tcPr>
+            <w:tcW w:w="605" w:type="dxa"/>
+          </w:tcPr>
+          <w:p>
+            <w:pPr>
+              <w:spacing w:before="0" w:after="0" w:line="240" w:lineRule="auto"/>
+              <w:jc w:val="center"/>
+            </w:pPr>
+          </w:p>
+        </w:tc>
+        <w:tc>
+          <w:tcPr>
+            <w:tcW w:w="608" w:type="dxa"/>
+            <w:shd w:val="clear" w:color="auto" w:fill="27166F"/>
+          </w:tcPr>
+          <w:p>
+            <w:pPr>
+              <w:spacing w:before="0" w:after="0" w:line="240" w:lineRule="auto"/>
+              <w:jc w:val="center"/>
+            </w:pPr>
+          </w:p>
+        </w:tc>
+      </w:tr>
+      <w:tr>
+        <w:tc>
+          <w:tcPr>
+            <w:tcW w:w="550" w:type="dxa"/>
+          </w:tcPr>
+          <w:p>
+            <w:pPr>
+              <w:spacing w:before="0" w:after="0" w:line="240" w:lineRule="auto"/>
+            </w:pPr>
+            <w:r>
+              <w:rPr>
+                <w:sz w:val="16"/>
+              </w:rPr>
+              <w:t>10</w:t>
+            </w:r>
+          </w:p>
+        </w:tc>
+        <w:tc>
+          <w:tcPr>
+            <w:tcW w:w="900" w:type="dxa"/>
+            <w:vMerge w:val="restart"/>
+          </w:tcPr>
+          <w:p>
+            <w:pPr>
+              <w:spacing w:before="0" w:after="0" w:line="240" w:lineRule="auto"/>
+            </w:pPr>
+            <w:r>
+              <w:rPr>
+                <w:b/>
+                <w:sz w:val="16"/>
+              </w:rPr>
+              <w:t>Supply</w:t>
+            </w:r>
+          </w:p>
+        </w:tc>
+        <w:tc>
+          <w:tcPr>
+            <w:tcW w:w="2250" w:type="dxa"/>
+          </w:tcPr>
+          <w:p>
+            <w:pPr>
+              <w:spacing w:before="0" w:after="0" w:line="240" w:lineRule="auto"/>
+            </w:pPr>
+            <w:r>
+              <w:rPr>
+                <w:sz w:val="16"/>
+              </w:rPr>
+              <w:t>Bill of Material finalisation and procurement</w:t>
+            </w:r>
+          </w:p>
+        </w:tc>
+        <w:tc>
+          <w:tcPr>
+            <w:tcW w:w="600" w:type="dxa"/>
+          </w:tcPr>
+          <w:p>
+            <w:pPr>
+              <w:spacing w:before="0" w:after="0" w:line="240" w:lineRule="auto"/>
+              <w:jc w:val="center"/>
+            </w:pPr>
+            <w:r>
+              <w:rPr>
+                <w:sz w:val="16"/>
+              </w:rPr>
+              <w:t>2</w:t>
+            </w:r>
+          </w:p>
+        </w:tc>
+        <w:tc>
+          <w:tcPr>
+            <w:tcW w:w="600" w:type="dxa"/>
+          </w:tcPr>
+          <w:p>
+            <w:pPr>
+              <w:spacing w:before="0" w:after="0" w:line="240" w:lineRule="auto"/>
+              <w:jc w:val="center"/>
+            </w:pPr>
+            <w:r>
+              <w:rPr>
+                <w:sz w:val="16"/>
+              </w:rPr>
+              <w:t>2</w:t>
+            </w:r>
+          </w:p>
+        </w:tc>
+        <w:tc>
+          <w:tcPr>
+            <w:tcW w:w="605" w:type="dxa"/>
+            <w:shd w:val="clear" w:color="auto" w:fill="9B8FC4"/>
+          </w:tcPr>
+          <w:p>
+            <w:pPr>
+              <w:spacing w:before="0" w:after="0" w:line="240" w:lineRule="auto"/>
+              <w:jc w:val="center"/>
+            </w:pPr>
+          </w:p>
+        </w:tc>
+        <w:tc>
+          <w:tcPr>
+            <w:tcW w:w="605" w:type="dxa"/>
+          </w:tcPr>
+          <w:p>
+            <w:pPr>
+              <w:spacing w:before="0" w:after="0" w:line="240" w:lineRule="auto"/>
+              <w:jc w:val="center"/>
+            </w:pPr>
+          </w:p>
+        </w:tc>
+        <w:tc>
+          <w:tcPr>
+            <w:tcW w:w="605" w:type="dxa"/>
+          </w:tcPr>
+          <w:p>
+            <w:pPr>
+              <w:spacing w:before="0" w:after="0" w:line="240" w:lineRule="auto"/>
+              <w:jc w:val="center"/>
+            </w:pPr>
+          </w:p>
+        </w:tc>
+        <w:tc>
+          <w:tcPr>
+            <w:tcW w:w="605" w:type="dxa"/>
+          </w:tcPr>
+          <w:p>
+            <w:pPr>
+              <w:spacing w:before="0" w:after="0" w:line="240" w:lineRule="auto"/>
+              <w:jc w:val="center"/>
+            </w:pPr>
+          </w:p>
+        </w:tc>
+        <w:tc>
+          <w:tcPr>
+            <w:tcW w:w="605" w:type="dxa"/>
+          </w:tcPr>
+          <w:p>
+            <w:pPr>
+              <w:spacing w:before="0" w:after="0" w:line="240" w:lineRule="auto"/>
+              <w:jc w:val="center"/>
+            </w:pPr>
+          </w:p>
+        </w:tc>
+        <w:tc>
+          <w:tcPr>
+            <w:tcW w:w="605" w:type="dxa"/>
+          </w:tcPr>
+          <w:p>
+            <w:pPr>
+              <w:spacing w:before="0" w:after="0" w:line="240" w:lineRule="auto"/>
+              <w:jc w:val="center"/>
+            </w:pPr>
+          </w:p>
+        </w:tc>
+        <w:tc>
+          <w:tcPr>
+            <w:tcW w:w="605" w:type="dxa"/>
+          </w:tcPr>
+          <w:p>
+            <w:pPr>
+              <w:spacing w:before="0" w:after="0" w:line="240" w:lineRule="auto"/>
+              <w:jc w:val="center"/>
+            </w:pPr>
+          </w:p>
+        </w:tc>
+        <w:tc>
+          <w:tcPr>
+            <w:tcW w:w="605" w:type="dxa"/>
+          </w:tcPr>
+          <w:p>
+            <w:pPr>
+              <w:spacing w:before="0" w:after="0" w:line="240" w:lineRule="auto"/>
+              <w:jc w:val="center"/>
+            </w:pPr>
+          </w:p>
+        </w:tc>
+        <w:tc>
+          <w:tcPr>
+            <w:tcW w:w="608" w:type="dxa"/>
+          </w:tcPr>
+          <w:p>
+            <w:pPr>
+              <w:spacing w:before="0" w:after="0" w:line="240" w:lineRule="auto"/>
+              <w:jc w:val="center"/>
+            </w:pPr>
+          </w:p>
+        </w:tc>
+      </w:tr>
+      <w:tr>
+        <w:tc>
+          <w:tcPr>
+            <w:tcW w:w="550" w:type="dxa"/>
+          </w:tcPr>
+          <w:p>
+            <w:pPr>
+              <w:spacing w:before="0" w:after="0" w:line="240" w:lineRule="auto"/>
+            </w:pPr>
+            <w:r>
+              <w:rPr>
+                <w:sz w:val="16"/>
+              </w:rPr>
+              <w:t>11</w:t>
+            </w:r>
+          </w:p>
+        </w:tc>
+        <w:tc>
+          <w:tcPr>
+            <w:tcW w:w="900" w:type="dxa"/>
+            <w:vMerge/>
+          </w:tcPr>
+          <w:p>
+            <w:pPr>
+              <w:spacing w:before="0" w:after="0" w:line="240" w:lineRule="auto"/>
+            </w:pPr>
+          </w:p>
+        </w:tc>
+        <w:tc>
+          <w:tcPr>
+            <w:tcW w:w="2250" w:type="dxa"/>
+          </w:tcPr>
+          <w:p>
+            <w:pPr>
+              <w:spacing w:before="0" w:after="0" w:line="240" w:lineRule="auto"/>
+            </w:pPr>
+            <w:r>
+              <w:rPr>
+                <w:sz w:val="16"/>
+              </w:rPr>
+              <w:t>Material delivery</w:t>
+            </w:r>
+          </w:p>
+        </w:tc>
+        <w:tc>
+          <w:tcPr>
+            <w:tcW w:w="600" w:type="dxa"/>
+          </w:tcPr>
+          <w:p>
+            <w:pPr>
+              <w:spacing w:before="0" w:after="0" w:line="240" w:lineRule="auto"/>
+              <w:jc w:val="center"/>
+            </w:pPr>
+            <w:r>
+              <w:rPr>
+                <w:sz w:val="16"/>
+              </w:rPr>
+              <w:t>4</w:t>
+            </w:r>
+          </w:p>
+        </w:tc>
+        <w:tc>
+          <w:tcPr>
+            <w:tcW w:w="600" w:type="dxa"/>
+          </w:tcPr>
+          <w:p>
+            <w:pPr>
+              <w:spacing w:before="0" w:after="0" w:line="240" w:lineRule="auto"/>
+              <w:jc w:val="center"/>
+            </w:pPr>
+            <w:r>
+              <w:rPr>
+                <w:sz w:val="16"/>
+              </w:rPr>
+              <w:t>6</w:t>
+            </w:r>
+          </w:p>
+        </w:tc>
+        <w:tc>
+          <w:tcPr>
+            <w:tcW w:w="605" w:type="dxa"/>
+            <w:shd w:val="clear" w:color="auto" w:fill="9B8FC4"/>
+          </w:tcPr>
+          <w:p>
+            <w:pPr>
+              <w:spacing w:before="0" w:after="0" w:line="240" w:lineRule="auto"/>
+              <w:jc w:val="center"/>
+            </w:pPr>
+          </w:p>
+        </w:tc>
+        <w:tc>
+          <w:tcPr>
+            <w:tcW w:w="605" w:type="dxa"/>
+            <w:shd w:val="clear" w:color="auto" w:fill="9B8FC4"/>
+          </w:tcPr>
+          <w:p>
+            <w:pPr>
+              <w:spacing w:before="0" w:after="0" w:line="240" w:lineRule="auto"/>
+              <w:jc w:val="center"/>
+            </w:pPr>
+          </w:p>
+        </w:tc>
+        <w:tc>
+          <w:tcPr>
+            <w:tcW w:w="605" w:type="dxa"/>
+          </w:tcPr>
+          <w:p>
+            <w:pPr>
+              <w:spacing w:before="0" w:after="0" w:line="240" w:lineRule="auto"/>
+              <w:jc w:val="center"/>
+            </w:pPr>
+          </w:p>
+        </w:tc>
+        <w:tc>
+          <w:tcPr>
+            <w:tcW w:w="605" w:type="dxa"/>
+          </w:tcPr>
+          <w:p>
+            <w:pPr>
+              <w:spacing w:before="0" w:after="0" w:line="240" w:lineRule="auto"/>
+              <w:jc w:val="center"/>
+            </w:pPr>
+          </w:p>
+        </w:tc>
+        <w:tc>
+          <w:tcPr>
+            <w:tcW w:w="605" w:type="dxa"/>
+          </w:tcPr>
+          <w:p>
+            <w:pPr>
+              <w:spacing w:before="0" w:after="0" w:line="240" w:lineRule="auto"/>
+              <w:jc w:val="center"/>
+            </w:pPr>
+          </w:p>
+        </w:tc>
+        <w:tc>
+          <w:tcPr>
+            <w:tcW w:w="605" w:type="dxa"/>
+          </w:tcPr>
+          <w:p>
+            <w:pPr>
+              <w:spacing w:before="0" w:after="0" w:line="240" w:lineRule="auto"/>
+              <w:jc w:val="center"/>
+            </w:pPr>
+          </w:p>
+        </w:tc>
+        <w:tc>
+          <w:tcPr>
+            <w:tcW w:w="605" w:type="dxa"/>
+          </w:tcPr>
+          <w:p>
+            <w:pPr>
+              <w:spacing w:before="0" w:after="0" w:line="240" w:lineRule="auto"/>
+              <w:jc w:val="center"/>
+            </w:pPr>
+          </w:p>
+        </w:tc>
+        <w:tc>
+          <w:tcPr>
+            <w:tcW w:w="605" w:type="dxa"/>
+          </w:tcPr>
+          <w:p>
+            <w:pPr>
+              <w:spacing w:before="0" w:after="0" w:line="240" w:lineRule="auto"/>
+              <w:jc w:val="center"/>
+            </w:pPr>
+          </w:p>
+        </w:tc>
+        <w:tc>
+          <w:tcPr>
+            <w:tcW w:w="608" w:type="dxa"/>
+          </w:tcPr>
+          <w:p>
+            <w:pPr>
+              <w:spacing w:before="0" w:after="0" w:line="240" w:lineRule="auto"/>
+              <w:jc w:val="center"/>
+            </w:pPr>
+          </w:p>
+        </w:tc>
+      </w:tr>
+      <w:tr>
+        <w:tc>
+          <w:tcPr>
+            <w:tcW w:w="550" w:type="dxa"/>
+          </w:tcPr>
+          <w:p>
+            <w:pPr>
+              <w:spacing w:before="0" w:after="0" w:line="240" w:lineRule="auto"/>
+            </w:pPr>
+            <w:r>
+              <w:rPr>
+                <w:sz w:val="16"/>
+              </w:rPr>
+              <w:t>12</w:t>
+            </w:r>
+          </w:p>
+        </w:tc>
+        <w:tc>
+          <w:tcPr>
+            <w:tcW w:w="900" w:type="dxa"/>
+            <w:vMerge/>
+          </w:tcPr>
+          <w:p>
+            <w:pPr>
+              <w:spacing w:before="0" w:after="0" w:line="240" w:lineRule="auto"/>
+            </w:pPr>
+          </w:p>
+        </w:tc>
+        <w:tc>
+          <w:tcPr>
+            <w:tcW w:w="2250" w:type="dxa"/>
+          </w:tcPr>
+          <w:p>
+            <w:pPr>
+              <w:spacing w:before="0" w:after="0" w:line="240" w:lineRule="auto"/>
+            </w:pPr>
+            <w:r>
+              <w:rPr>
+                <w:sz w:val="16"/>
+              </w:rPr>
+              <w:t>Material readiness and staging</w:t>
+            </w:r>
+          </w:p>
+        </w:tc>
+        <w:tc>
+          <w:tcPr>
+            <w:tcW w:w="600" w:type="dxa"/>
+          </w:tcPr>
+          <w:p>
+            <w:pPr>
+              <w:spacing w:before="0" w:after="0" w:line="240" w:lineRule="auto"/>
+              <w:jc w:val="center"/>
+            </w:pPr>
+            <w:r>
+              <w:rPr>
+                <w:sz w:val="16"/>
+              </w:rPr>
+              <w:t>10</w:t>
+            </w:r>
+          </w:p>
+        </w:tc>
+        <w:tc>
+          <w:tcPr>
+            <w:tcW w:w="600" w:type="dxa"/>
+          </w:tcPr>
+          <w:p>
+            <w:pPr>
+              <w:spacing w:before="0" w:after="0" w:line="240" w:lineRule="auto"/>
+              <w:jc w:val="center"/>
+            </w:pPr>
+            <w:r>
+              <w:rPr>
+                <w:sz w:val="16"/>
+              </w:rPr>
+              <w:t>4</w:t>
+            </w:r>
+          </w:p>
+        </w:tc>
+        <w:tc>
+          <w:tcPr>
+            <w:tcW w:w="605" w:type="dxa"/>
+          </w:tcPr>
+          <w:p>
+            <w:pPr>
+              <w:spacing w:before="0" w:after="0" w:line="240" w:lineRule="auto"/>
+              <w:jc w:val="center"/>
+            </w:pPr>
+          </w:p>
+        </w:tc>
+        <w:tc>
+          <w:tcPr>
+            <w:tcW w:w="605" w:type="dxa"/>
+          </w:tcPr>
+          <w:p>
+            <w:pPr>
+              <w:spacing w:before="0" w:after="0" w:line="240" w:lineRule="auto"/>
+              <w:jc w:val="center"/>
+            </w:pPr>
+          </w:p>
+        </w:tc>
+        <w:tc>
+          <w:tcPr>
+            <w:tcW w:w="605" w:type="dxa"/>
+            <w:shd w:val="clear" w:color="auto" w:fill="9B8FC4"/>
+          </w:tcPr>
+          <w:p>
+            <w:pPr>
+              <w:spacing w:before="0" w:after="0" w:line="240" w:lineRule="auto"/>
+              <w:jc w:val="center"/>
+            </w:pPr>
+          </w:p>
+        </w:tc>
+        <w:tc>
+          <w:tcPr>
+            <w:tcW w:w="605" w:type="dxa"/>
+          </w:tcPr>
+          <w:p>
+            <w:pPr>
+              <w:spacing w:before="0" w:after="0" w:line="240" w:lineRule="auto"/>
+              <w:jc w:val="center"/>
+            </w:pPr>
+          </w:p>
+        </w:tc>
+        <w:tc>
+          <w:tcPr>
+            <w:tcW w:w="605" w:type="dxa"/>
+          </w:tcPr>
+          <w:p>
+            <w:pPr>
+              <w:spacing w:before="0" w:after="0" w:line="240" w:lineRule="auto"/>
+              <w:jc w:val="center"/>
+            </w:pPr>
+          </w:p>
+        </w:tc>
+        <w:tc>
+          <w:tcPr>
+            <w:tcW w:w="605" w:type="dxa"/>
+          </w:tcPr>
+          <w:p>
+            <w:pPr>
+              <w:spacing w:before="0" w:after="0" w:line="240" w:lineRule="auto"/>
+              <w:jc w:val="center"/>
+            </w:pPr>
+          </w:p>
+        </w:tc>
+        <w:tc>
+          <w:tcPr>
+            <w:tcW w:w="605" w:type="dxa"/>
+          </w:tcPr>
+          <w:p>
+            <w:pPr>
+              <w:spacing w:before="0" w:after="0" w:line="240" w:lineRule="auto"/>
+              <w:jc w:val="center"/>
+            </w:pPr>
+          </w:p>
+        </w:tc>
+        <w:tc>
+          <w:tcPr>
+            <w:tcW w:w="605" w:type="dxa"/>
+          </w:tcPr>
+          <w:p>
+            <w:pPr>
+              <w:spacing w:before="0" w:after="0" w:line="240" w:lineRule="auto"/>
+              <w:jc w:val="center"/>
+            </w:pPr>
+          </w:p>
+        </w:tc>
+        <w:tc>
+          <w:tcPr>
+            <w:tcW w:w="608" w:type="dxa"/>
+          </w:tcPr>
+          <w:p>
+            <w:pPr>
+              <w:spacing w:before="0" w:after="0" w:line="240" w:lineRule="auto"/>
+              <w:jc w:val="center"/>
+            </w:pPr>
+          </w:p>
+        </w:tc>
+      </w:tr>
+      <w:tr>
+        <w:tc>
+          <w:tcPr>
+            <w:tcW w:w="550" w:type="dxa"/>
+          </w:tcPr>
+          <w:p>
+            <w:pPr>
+              <w:spacing w:before="0" w:after="0" w:line="240" w:lineRule="auto"/>
+            </w:pPr>
+            <w:r>
+              <w:rPr>
+                <w:sz w:val="16"/>
+              </w:rPr>
+              <w:t>13</w:t>
+            </w:r>
+          </w:p>
+        </w:tc>
+        <w:tc>
+          <w:tcPr>
+            <w:tcW w:w="900" w:type="dxa"/>
+            <w:vMerge/>
+          </w:tcPr>
+          <w:p>
+            <w:pPr>
+              <w:spacing w:before="0" w:after="0" w:line="240" w:lineRule="auto"/>
+            </w:pPr>
+          </w:p>
+        </w:tc>
+        <w:tc>
+          <w:tcPr>
+            <w:tcW w:w="2250" w:type="dxa"/>
+          </w:tcPr>
+          <w:p>
+            <w:pPr>
+              <w:spacing w:before="0" w:after="0" w:line="240" w:lineRule="auto"/>
+            </w:pPr>
+            <w:r>
+              <w:rPr>
+                <w:sz w:val="16"/>
+              </w:rPr>
+              <w:t>Interfacing hardware installation and commissioning</w:t>
+            </w:r>
+          </w:p>
+        </w:tc>
+        <w:tc>
+          <w:tcPr>
+            <w:tcW w:w="600" w:type="dxa"/>
+          </w:tcPr>
+          <w:p>
+            <w:pPr>
+              <w:spacing w:before="0" w:after="0" w:line="240" w:lineRule="auto"/>
+              <w:jc w:val="center"/>
+            </w:pPr>
+            <w:r>
+              <w:rPr>
+                <w:sz w:val="16"/>
+              </w:rPr>
+              <w:t>14</w:t>
+            </w:r>
+          </w:p>
+        </w:tc>
+        <w:tc>
+          <w:tcPr>
+            <w:tcW w:w="600" w:type="dxa"/>
+          </w:tcPr>
+          <w:p>
+            <w:pPr>
+              <w:spacing w:before="0" w:after="0" w:line="240" w:lineRule="auto"/>
+              <w:jc w:val="center"/>
+            </w:pPr>
+            <w:r>
+              <w:rPr>
+                <w:sz w:val="16"/>
+              </w:rPr>
+              <w:t>8</w:t>
+            </w:r>
+          </w:p>
+        </w:tc>
+        <w:tc>
+          <w:tcPr>
+            <w:tcW w:w="605" w:type="dxa"/>
+          </w:tcPr>
+          <w:p>
+            <w:pPr>
+              <w:spacing w:before="0" w:after="0" w:line="240" w:lineRule="auto"/>
+              <w:jc w:val="center"/>
+            </w:pPr>
+          </w:p>
+        </w:tc>
+        <w:tc>
+          <w:tcPr>
+            <w:tcW w:w="605" w:type="dxa"/>
+          </w:tcPr>
+          <w:p>
+            <w:pPr>
+              <w:spacing w:before="0" w:after="0" w:line="240" w:lineRule="auto"/>
+              <w:jc w:val="center"/>
+            </w:pPr>
+          </w:p>
+        </w:tc>
+        <w:tc>
+          <w:tcPr>
+            <w:tcW w:w="605" w:type="dxa"/>
+          </w:tcPr>
+          <w:p>
+            <w:pPr>
+              <w:spacing w:before="0" w:after="0" w:line="240" w:lineRule="auto"/>
+              <w:jc w:val="center"/>
+            </w:pPr>
+          </w:p>
+        </w:tc>
+        <w:tc>
+          <w:tcPr>
+            <w:tcW w:w="605" w:type="dxa"/>
+            <w:shd w:val="clear" w:color="auto" w:fill="9B8FC4"/>
+          </w:tcPr>
+          <w:p>
+            <w:pPr>
+              <w:spacing w:before="0" w:after="0" w:line="240" w:lineRule="auto"/>
+              <w:jc w:val="center"/>
+            </w:pPr>
+          </w:p>
+        </w:tc>
+        <w:tc>
+          <w:tcPr>
+            <w:tcW w:w="605" w:type="dxa"/>
+            <w:shd w:val="clear" w:color="auto" w:fill="9B8FC4"/>
+          </w:tcPr>
+          <w:p>
+            <w:pPr>
+              <w:spacing w:before="0" w:after="0" w:line="240" w:lineRule="auto"/>
+              <w:jc w:val="center"/>
+            </w:pPr>
+          </w:p>
+        </w:tc>
+        <w:tc>
+          <w:tcPr>
+            <w:tcW w:w="605" w:type="dxa"/>
+          </w:tcPr>
+          <w:p>
+            <w:pPr>
+              <w:spacing w:before="0" w:after="0" w:line="240" w:lineRule="auto"/>
+              <w:jc w:val="center"/>
+            </w:pPr>
+          </w:p>
+        </w:tc>
+        <w:tc>
+          <w:tcPr>
+            <w:tcW w:w="605" w:type="dxa"/>
+          </w:tcPr>
+          <w:p>
+            <w:pPr>
+              <w:spacing w:before="0" w:after="0" w:line="240" w:lineRule="auto"/>
+              <w:jc w:val="center"/>
+            </w:pPr>
+          </w:p>
+        </w:tc>
+        <w:tc>
+          <w:tcPr>
+            <w:tcW w:w="605" w:type="dxa"/>
+          </w:tcPr>
+          <w:p>
+            <w:pPr>
+              <w:spacing w:before="0" w:after="0" w:line="240" w:lineRule="auto"/>
+              <w:jc w:val="center"/>
+            </w:pPr>
+          </w:p>
+        </w:tc>
+        <w:tc>
+          <w:tcPr>
+            <w:tcW w:w="608" w:type="dxa"/>
+          </w:tcPr>
+          <w:p>
+            <w:pPr>
+              <w:spacing w:before="0" w:after="0" w:line="240" w:lineRule="auto"/>
+              <w:jc w:val="center"/>
+            </w:pPr>
+          </w:p>
+        </w:tc>
+      </w:tr>
+    </w:tbl>
+    <w:p>
+      <w:pPr>
+        <w:pStyle w:val="Caption"/>
+      </w:pPr>
+      <w:r>
+        <w:rPr>
+          <w:b w:val="0"/>
+        </w:rPr>
+        <w:t>Table: Project timeline – 9 months from kick‑off</w:t>
+      </w:r>
+    </w:p>
+    <w:p>
+      <w:pPr/>
+      <w:r>
+        <w:rPr>
+          <w:b/>
+        </w:rPr>
+        <w:t>Basis of the schedule:</w:t>
+      </w:r>
+    </w:p>
+    <w:p>
+      <w:pPr>
+        <w:pStyle w:val="ListParagraph"/>
+        <w:numPr>
+          <w:ilvl w:val="0"/>
+          <w:numId w:val="48"/>
+        </w:numPr>
+      </w:pPr>
+      <w:r>
+        <w:rPr>
+          <w:b w:val="0"/>
+        </w:rPr>
+        <w:t>Week 1 is the project kick‑off week. All dates are working weeks and assume the customer stakeholders, third party OEMs and site access are available as set out in the Roles and Responsibilities section.</w:t>
+      </w:r>
+    </w:p>
+    <w:p>
+      <w:pPr>
+        <w:pStyle w:val="ListParagraph"/>
+        <w:numPr>
+          <w:ilvl w:val="0"/>
+          <w:numId w:val="48"/>
+        </w:numPr>
+      </w:pPr>
+      <w:r>
+        <w:rPr>
+          <w:b w:val="0"/>
+        </w:rPr>
+        <w:t>The schedule is driven by the sign off checkpoints. BRD sign off at the end of week 3, FDS and ICD sign off at the end of week 8, and UAT sign off at the end of week 28 are the gates for the following phase. A delay at any gate moves the remaining schedule by the same period.</w:t>
+      </w:r>
+    </w:p>
+    <w:p>
+      <w:pPr>
+        <w:pStyle w:val="ListParagraph"/>
+        <w:numPr>
+          <w:ilvl w:val="0"/>
+          <w:numId w:val="48"/>
+        </w:numPr>
+      </w:pPr>
+      <w:r>
+        <w:rPr>
+          <w:b w:val="0"/>
+        </w:rPr>
+        <w:t>Interfacing hardware is procured and delivered in parallel with design and development, and is installed and commissioned between weeks 14 and 21, so that machine data is available before User Acceptance Testing begins in week 24.</w:t>
+      </w:r>
+    </w:p>
+    <w:p>
+      <w:pPr>
+        <w:pStyle w:val="ListParagraph"/>
+        <w:numPr>
+          <w:ilvl w:val="0"/>
+          <w:numId w:val="48"/>
+        </w:numPr>
+      </w:pPr>
+      <w:r>
+        <w:rPr>
+          <w:b w:val="0"/>
+        </w:rPr>
+        <w:t>Material delivery of 6 weeks assumes the interfacing hardware in the Bill of Material is available on standard lead times. Imported items on extended lead times would move the commissioning window and, with it, the testing phases.</w:t>
+      </w:r>
+    </w:p>
+    <w:p>
+      <w:pPr>
+        <w:pStyle w:val="ListParagraph"/>
+        <w:numPr>
+          <w:ilvl w:val="0"/>
+          <w:numId w:val="48"/>
+        </w:numPr>
+      </w:pPr>
+      <w:r>
+        <w:rPr>
+          <w:b w:val="0"/>
+        </w:rPr>
+        <w:t>Machines that are new or under refurbishment, and the machines still to be reconciled in Unit‑4, are to be available for interfacing before the commissioning window closes. Machines handed over later are addressed by change request.</w:t>
+      </w:r>
+    </w:p>
+    <w:p>
+      <w:pPr>
+        <w:pStyle w:val="ListParagraph"/>
+        <w:numPr>
+          <w:ilvl w:val="0"/>
+          <w:numId w:val="48"/>
+        </w:numPr>
+      </w:pPr>
+      <w:r>
+        <w:rPr>
+          <w:b w:val="0"/>
+        </w:rPr>
+        <w:t>Hyper Care runs for 6 weeks after Go Live, followed by handover. A longer hyper care or an extended support period can be offered separately.</w:t>
+      </w:r>
     </w:p>
     <w:p/>
     <w:p/>
@@ -45234,6 +47974,12 @@
       <w:startOverride w:val="1"/>
     </w:lvlOverride>
   </w:num>
+  <w:num w:numId="48">
+    <w:abstractNumId w:val="6"/>
+    <w:lvlOverride w:ilvl="0">
+      <w:startOverride w:val="1"/>
+    </w:lvlOverride>
+  </w:num>
   <w:numIdMacAtCleanup w:val="12"/>
 </w:numbering>
 </file>

</xml_diff>